<commit_message>
TS 6.6 Kramam Jatai compare Sanskrit and Tamil
</commit_message>
<xml_diff>
--- a/TS-Kramam/TS-6.6/TS 6.6 Sanskrit Krama Paatam Corrections.docx
+++ b/TS-Kramam/TS-6.6/TS 6.6 Sanskrit Krama Paatam Corrections.docx
@@ -1,6 +1,6 @@
 
 <file path=word/document.xml><?xml version="1.0" encoding="utf-8"?>
-<w:document xmlns:wpc="http://schemas.microsoft.com/office/word/2010/wordprocessingCanvas" xmlns:cx="http://schemas.microsoft.com/office/drawing/2014/chartex" xmlns:cx1="http://schemas.microsoft.com/office/drawing/2015/9/8/chartex" xmlns:mc="http://schemas.openxmlformats.org/markup-compatibility/2006" xmlns:o="urn:schemas-microsoft-com:office:office" xmlns:r="http://schemas.openxmlformats.org/officeDocument/2006/relationships" xmlns:m="http://schemas.openxmlformats.org/officeDocument/2006/math" xmlns:v="urn:schemas-microsoft-com:vml" xmlns:wp14="http://schemas.microsoft.com/office/word/2010/wordprocessingDrawing" xmlns:wp="http://schemas.openxmlformats.org/drawingml/2006/wordprocessingDrawing" xmlns:w10="urn:schemas-microsoft-com:office:word" xmlns:w="http://schemas.openxmlformats.org/wordprocessingml/2006/main" xmlns:w14="http://schemas.microsoft.com/office/word/2010/wordml" xmlns:w15="http://schemas.microsoft.com/office/word/2012/wordml" xmlns:w16se="http://schemas.microsoft.com/office/word/2015/wordml/symex" xmlns:wpg="http://schemas.microsoft.com/office/word/2010/wordprocessingGroup" xmlns:wpi="http://schemas.microsoft.com/office/word/2010/wordprocessingInk" xmlns:wne="http://schemas.microsoft.com/office/word/2006/wordml" xmlns:wps="http://schemas.microsoft.com/office/word/2010/wordprocessingShape" mc:Ignorable="w14 w15 w16se wp14">
+<w:document xmlns:wpc="http://schemas.microsoft.com/office/word/2010/wordprocessingCanvas" xmlns:cx="http://schemas.microsoft.com/office/drawing/2014/chartex" xmlns:cx1="http://schemas.microsoft.com/office/drawing/2015/9/8/chartex" xmlns:cx2="http://schemas.microsoft.com/office/drawing/2015/10/21/chartex" xmlns:cx3="http://schemas.microsoft.com/office/drawing/2016/5/9/chartex" xmlns:cx4="http://schemas.microsoft.com/office/drawing/2016/5/10/chartex" xmlns:cx5="http://schemas.microsoft.com/office/drawing/2016/5/11/chartex" xmlns:cx6="http://schemas.microsoft.com/office/drawing/2016/5/12/chartex" xmlns:cx7="http://schemas.microsoft.com/office/drawing/2016/5/13/chartex" xmlns:cx8="http://schemas.microsoft.com/office/drawing/2016/5/14/chartex" xmlns:mc="http://schemas.openxmlformats.org/markup-compatibility/2006" xmlns:aink="http://schemas.microsoft.com/office/drawing/2016/ink" xmlns:am3d="http://schemas.microsoft.com/office/drawing/2017/model3d" xmlns:o="urn:schemas-microsoft-com:office:office" xmlns:oel="http://schemas.microsoft.com/office/2019/extlst" xmlns:r="http://schemas.openxmlformats.org/officeDocument/2006/relationships" xmlns:m="http://schemas.openxmlformats.org/officeDocument/2006/math" xmlns:v="urn:schemas-microsoft-com:vml" xmlns:wp14="http://schemas.microsoft.com/office/word/2010/wordprocessingDrawing" xmlns:wp="http://schemas.openxmlformats.org/drawingml/2006/wordprocessingDrawing" xmlns:w10="urn:schemas-microsoft-com:office:word" xmlns:w="http://schemas.openxmlformats.org/wordprocessingml/2006/main" xmlns:w14="http://schemas.microsoft.com/office/word/2010/wordml" xmlns:w15="http://schemas.microsoft.com/office/word/2012/wordml" xmlns:w16cex="http://schemas.microsoft.com/office/word/2018/wordml/cex" xmlns:w16cid="http://schemas.microsoft.com/office/word/2016/wordml/cid" xmlns:w16="http://schemas.microsoft.com/office/word/2018/wordml" xmlns:w16du="http://schemas.microsoft.com/office/word/2023/wordml/word16du" xmlns:w16sdtdh="http://schemas.microsoft.com/office/word/2020/wordml/sdtdatahash" xmlns:w16sdtfl="http://schemas.microsoft.com/office/word/2024/wordml/sdtformatlock" xmlns:w16se="http://schemas.microsoft.com/office/word/2015/wordml/symex" xmlns:wpg="http://schemas.microsoft.com/office/word/2010/wordprocessingGroup" xmlns:wpi="http://schemas.microsoft.com/office/word/2010/wordprocessingInk" xmlns:wne="http://schemas.microsoft.com/office/word/2006/wordml" xmlns:wps="http://schemas.microsoft.com/office/word/2010/wordprocessingShape" mc:Ignorable="w14 w15 w16se w16cid w16 w16cex w16sdtdh w16sdtfl w16du wp14">
   <w:body>
     <w:p>
       <w:pPr>
@@ -21,6 +21,1961 @@
           <w:szCs w:val="32"/>
           <w:u w:val="single"/>
         </w:rPr>
+        <w:t xml:space="preserve">TS </w:t>
+      </w:r>
+      <w:r>
+        <w:rPr>
+          <w:b/>
+          <w:bCs/>
+          <w:sz w:val="32"/>
+          <w:szCs w:val="32"/>
+          <w:u w:val="single"/>
+        </w:rPr>
+        <w:t>Krama</w:t>
+      </w:r>
+      <w:r>
+        <w:rPr>
+          <w:b/>
+          <w:bCs/>
+          <w:sz w:val="32"/>
+          <w:szCs w:val="32"/>
+          <w:u w:val="single"/>
+        </w:rPr>
+        <w:t xml:space="preserve"> Paatam – TS </w:t>
+      </w:r>
+      <w:r>
+        <w:rPr>
+          <w:b/>
+          <w:bCs/>
+          <w:sz w:val="32"/>
+          <w:szCs w:val="32"/>
+          <w:u w:val="single"/>
+        </w:rPr>
+        <w:t>6.6 Sanskrit</w:t>
+      </w:r>
+      <w:r>
+        <w:rPr>
+          <w:b/>
+          <w:bCs/>
+          <w:sz w:val="32"/>
+          <w:szCs w:val="32"/>
+          <w:u w:val="single"/>
+        </w:rPr>
+        <w:t xml:space="preserve"> Corrections –</w:t>
+      </w:r>
+      <w:r>
+        <w:rPr>
+          <w:b/>
+          <w:bCs/>
+          <w:sz w:val="32"/>
+          <w:szCs w:val="32"/>
+          <w:u w:val="single"/>
+        </w:rPr>
+        <w:t xml:space="preserve"> </w:t>
+      </w:r>
+      <w:r>
+        <w:rPr>
+          <w:b/>
+          <w:bCs/>
+          <w:sz w:val="32"/>
+          <w:szCs w:val="32"/>
+          <w:u w:val="single"/>
+        </w:rPr>
+        <w:t xml:space="preserve">Observed till </w:t>
+      </w:r>
+      <w:proofErr w:type="spellStart"/>
+      <w:r>
+        <w:rPr>
+          <w:b/>
+          <w:bCs/>
+          <w:color w:val="EE0000"/>
+          <w:sz w:val="32"/>
+          <w:szCs w:val="32"/>
+          <w:highlight w:val="yellow"/>
+          <w:u w:val="single"/>
+        </w:rPr>
+        <w:t>xxxxxxxxxxxxxxxxxx</w:t>
+      </w:r>
+      <w:proofErr w:type="spellEnd"/>
+    </w:p>
+    <w:p>
+      <w:pPr>
+        <w:jc w:val="center"/>
+        <w:rPr>
+          <w:b/>
+          <w:bCs/>
+        </w:rPr>
+      </w:pPr>
+      <w:r>
+        <w:rPr>
+          <w:b/>
+          <w:bCs/>
+        </w:rPr>
+        <w:t>(ignore those which are already incorporated in your book’s version and date)</w:t>
+      </w:r>
+    </w:p>
+    <w:tbl>
+      <w:tblPr>
+        <w:tblW w:w="13835" w:type="dxa"/>
+        <w:tblInd w:w="-792" w:type="dxa"/>
+        <w:tblBorders>
+          <w:top w:val="single" w:sz="4" w:space="0" w:color="000000"/>
+          <w:left w:val="single" w:sz="4" w:space="0" w:color="000000"/>
+          <w:bottom w:val="single" w:sz="4" w:space="0" w:color="000000"/>
+          <w:right w:val="single" w:sz="4" w:space="0" w:color="000000"/>
+          <w:insideH w:val="single" w:sz="4" w:space="0" w:color="000000"/>
+          <w:insideV w:val="single" w:sz="4" w:space="0" w:color="000000"/>
+        </w:tblBorders>
+        <w:tblLook w:val="04A0" w:firstRow="1" w:lastRow="0" w:firstColumn="1" w:lastColumn="0" w:noHBand="0" w:noVBand="1"/>
+      </w:tblPr>
+      <w:tblGrid>
+        <w:gridCol w:w="3877"/>
+        <w:gridCol w:w="4738"/>
+        <w:gridCol w:w="5220"/>
+      </w:tblGrid>
+      <w:tr>
+        <w:tc>
+          <w:tcPr>
+            <w:tcW w:w="3877" w:type="dxa"/>
+          </w:tcPr>
+          <w:p>
+            <w:pPr>
+              <w:spacing w:before="0" w:line="240" w:lineRule="auto"/>
+              <w:jc w:val="center"/>
+              <w:rPr>
+                <w:b/>
+                <w:bCs/>
+                <w:sz w:val="32"/>
+                <w:szCs w:val="32"/>
+              </w:rPr>
+            </w:pPr>
+            <w:r>
+              <w:rPr>
+                <w:b/>
+                <w:bCs/>
+                <w:sz w:val="32"/>
+                <w:szCs w:val="32"/>
+              </w:rPr>
+              <w:t>Section, Paragraph</w:t>
+            </w:r>
+          </w:p>
+          <w:p>
+            <w:pPr>
+              <w:spacing w:before="0" w:line="240" w:lineRule="auto"/>
+              <w:jc w:val="center"/>
+              <w:rPr>
+                <w:b/>
+                <w:bCs/>
+                <w:sz w:val="32"/>
+                <w:szCs w:val="32"/>
+              </w:rPr>
+            </w:pPr>
+            <w:r>
+              <w:rPr>
+                <w:b/>
+                <w:bCs/>
+                <w:sz w:val="32"/>
+                <w:szCs w:val="32"/>
+              </w:rPr>
+              <w:t>Reference</w:t>
+            </w:r>
+          </w:p>
+        </w:tc>
+        <w:tc>
+          <w:tcPr>
+            <w:tcW w:w="4738" w:type="dxa"/>
+          </w:tcPr>
+          <w:p>
+            <w:pPr>
+              <w:spacing w:before="0" w:line="240" w:lineRule="auto"/>
+              <w:jc w:val="center"/>
+              <w:rPr>
+                <w:b/>
+                <w:bCs/>
+                <w:sz w:val="32"/>
+                <w:szCs w:val="32"/>
+              </w:rPr>
+            </w:pPr>
+            <w:r>
+              <w:rPr>
+                <w:b/>
+                <w:bCs/>
+                <w:sz w:val="32"/>
+                <w:szCs w:val="32"/>
+              </w:rPr>
+              <w:t>As Printed</w:t>
+            </w:r>
+          </w:p>
+        </w:tc>
+        <w:tc>
+          <w:tcPr>
+            <w:tcW w:w="5220" w:type="dxa"/>
+          </w:tcPr>
+          <w:p>
+            <w:pPr>
+              <w:spacing w:before="0" w:line="240" w:lineRule="auto"/>
+              <w:ind w:right="-18"/>
+              <w:jc w:val="center"/>
+              <w:rPr>
+                <w:b/>
+                <w:bCs/>
+                <w:sz w:val="32"/>
+                <w:szCs w:val="32"/>
+              </w:rPr>
+            </w:pPr>
+            <w:r>
+              <w:rPr>
+                <w:b/>
+                <w:bCs/>
+                <w:sz w:val="32"/>
+                <w:szCs w:val="32"/>
+              </w:rPr>
+              <w:t>To be read as or corrected as</w:t>
+            </w:r>
+          </w:p>
+        </w:tc>
+      </w:tr>
+      <w:tr>
+        <w:trPr>
+          <w:trHeight w:val="1389"/>
+        </w:trPr>
+        <w:tc>
+          <w:tcPr>
+            <w:tcW w:w="3877" w:type="dxa"/>
+          </w:tcPr>
+          <w:p>
+            <w:pPr>
+              <w:widowControl w:val="0"/>
+              <w:tabs>
+                <w:tab w:val="left" w:pos="993"/>
+              </w:tabs>
+              <w:autoSpaceDE w:val="0"/>
+              <w:autoSpaceDN w:val="0"/>
+              <w:adjustRightInd w:val="0"/>
+              <w:spacing w:before="0" w:line="252" w:lineRule="auto"/>
+              <w:ind w:right="297"/>
+              <w:rPr>
+                <w:rFonts w:cs="Arial"/>
+                <w:b/>
+                <w:sz w:val="28"/>
+                <w:szCs w:val="28"/>
+              </w:rPr>
+            </w:pPr>
+            <w:r>
+              <w:rPr>
+                <w:rFonts w:cs="Arial"/>
+                <w:b/>
+                <w:sz w:val="28"/>
+                <w:szCs w:val="28"/>
+              </w:rPr>
+              <w:t>T.S.6.6.</w:t>
+            </w:r>
+            <w:r>
+              <w:rPr>
+                <w:rFonts w:cs="Arial"/>
+                <w:b/>
+                <w:sz w:val="28"/>
+                <w:szCs w:val="28"/>
+              </w:rPr>
+              <w:t>2</w:t>
+            </w:r>
+            <w:r>
+              <w:rPr>
+                <w:rFonts w:cs="Arial"/>
+                <w:b/>
+                <w:sz w:val="28"/>
+                <w:szCs w:val="28"/>
+              </w:rPr>
+              <w:t>.</w:t>
+            </w:r>
+            <w:r>
+              <w:rPr>
+                <w:rFonts w:cs="Arial"/>
+                <w:b/>
+                <w:sz w:val="28"/>
+                <w:szCs w:val="28"/>
+              </w:rPr>
+              <w:t>3</w:t>
+            </w:r>
+            <w:r>
+              <w:rPr>
+                <w:rFonts w:cs="Arial"/>
+                <w:b/>
+                <w:sz w:val="28"/>
+                <w:szCs w:val="28"/>
+              </w:rPr>
+              <w:t xml:space="preserve"> – Kramam</w:t>
+            </w:r>
+          </w:p>
+          <w:p>
+            <w:pPr>
+              <w:widowControl w:val="0"/>
+              <w:tabs>
+                <w:tab w:val="left" w:pos="993"/>
+              </w:tabs>
+              <w:autoSpaceDE w:val="0"/>
+              <w:autoSpaceDN w:val="0"/>
+              <w:adjustRightInd w:val="0"/>
+              <w:spacing w:before="0" w:line="252" w:lineRule="auto"/>
+              <w:ind w:right="297"/>
+              <w:rPr>
+                <w:rFonts w:cs="Arial"/>
+                <w:b/>
+                <w:sz w:val="28"/>
+                <w:szCs w:val="28"/>
+              </w:rPr>
+            </w:pPr>
+            <w:r>
+              <w:rPr>
+                <w:rFonts w:cs="Arial"/>
+                <w:b/>
+                <w:sz w:val="28"/>
+                <w:szCs w:val="28"/>
+              </w:rPr>
+              <w:t xml:space="preserve">Krama Vaakyam No.– </w:t>
+            </w:r>
+            <w:r>
+              <w:rPr>
+                <w:rFonts w:cs="Arial"/>
+                <w:b/>
+                <w:sz w:val="28"/>
+                <w:szCs w:val="28"/>
+              </w:rPr>
+              <w:t>34,35</w:t>
+            </w:r>
+          </w:p>
+          <w:p>
+            <w:pPr>
+              <w:widowControl w:val="0"/>
+              <w:tabs>
+                <w:tab w:val="left" w:pos="993"/>
+              </w:tabs>
+              <w:autoSpaceDE w:val="0"/>
+              <w:autoSpaceDN w:val="0"/>
+              <w:adjustRightInd w:val="0"/>
+              <w:spacing w:before="0" w:line="252" w:lineRule="auto"/>
+              <w:ind w:right="297"/>
+              <w:rPr>
+                <w:rFonts w:cs="Arial"/>
+                <w:b/>
+                <w:sz w:val="28"/>
+                <w:szCs w:val="28"/>
+              </w:rPr>
+            </w:pPr>
+            <w:r>
+              <w:rPr>
+                <w:rFonts w:cs="Arial"/>
+                <w:b/>
+                <w:sz w:val="28"/>
+                <w:szCs w:val="28"/>
+              </w:rPr>
+              <w:t xml:space="preserve">Panchaati No. - </w:t>
+            </w:r>
+            <w:r>
+              <w:rPr>
+                <w:rFonts w:cs="Arial"/>
+                <w:b/>
+                <w:sz w:val="28"/>
+                <w:szCs w:val="28"/>
+              </w:rPr>
+              <w:t>8</w:t>
+            </w:r>
+          </w:p>
+        </w:tc>
+        <w:tc>
+          <w:tcPr>
+            <w:tcW w:w="4738" w:type="dxa"/>
+          </w:tcPr>
+          <w:p>
+            <w:pPr>
+              <w:widowControl w:val="0"/>
+              <w:autoSpaceDE w:val="0"/>
+              <w:autoSpaceDN w:val="0"/>
+              <w:adjustRightInd w:val="0"/>
+              <w:spacing w:line="252" w:lineRule="auto"/>
+              <w:rPr>
+                <w:rFonts w:ascii="BRH Devanagari Extra" w:hAnsi="BRH Devanagari Extra" w:cs="BRH Devanagari Extra"/>
+                <w:color w:val="000000"/>
+                <w:sz w:val="40"/>
+                <w:szCs w:val="40"/>
+                <w:lang w:bidi="ml-IN"/>
+              </w:rPr>
+            </w:pPr>
+            <w:proofErr w:type="spellStart"/>
+            <w:r>
+              <w:rPr>
+                <w:rFonts w:ascii="BRH Devanagari Extra" w:hAnsi="BRH Devanagari Extra" w:cs="BRH Devanagari Extra"/>
+                <w:color w:val="000000"/>
+                <w:sz w:val="40"/>
+                <w:szCs w:val="40"/>
+                <w:lang w:bidi="ml-IN"/>
+              </w:rPr>
+              <w:t>aÉÉ</w:t>
+            </w:r>
+            <w:proofErr w:type="spellEnd"/>
+            <w:r>
+              <w:rPr>
+                <w:rFonts w:ascii="BRH Malayalam Extra" w:hAnsi="BRH Malayalam Extra" w:cs="BRH Devanagari Extra"/>
+                <w:b/>
+                <w:color w:val="000000"/>
+                <w:sz w:val="32"/>
+                <w:szCs w:val="40"/>
+                <w:lang w:bidi="ml-IN"/>
+              </w:rPr>
+              <w:t>–</w:t>
+            </w:r>
+            <w:proofErr w:type="spellStart"/>
+            <w:r>
+              <w:rPr>
+                <w:rFonts w:ascii="BRH Devanagari Extra" w:hAnsi="BRH Devanagari Extra" w:cs="BRH Devanagari Extra"/>
+                <w:color w:val="000000"/>
+                <w:sz w:val="40"/>
+                <w:szCs w:val="40"/>
+                <w:lang w:bidi="ml-IN"/>
+              </w:rPr>
+              <w:t>iÉÑqÉç</w:t>
+            </w:r>
+            <w:proofErr w:type="spellEnd"/>
+            <w:r>
+              <w:rPr>
+                <w:rFonts w:ascii="BRH Devanagari Extra" w:hAnsi="BRH Devanagari Extra" w:cs="BRH Devanagari Extra"/>
+                <w:color w:val="000000"/>
+                <w:sz w:val="40"/>
+                <w:szCs w:val="40"/>
+                <w:lang w:bidi="ml-IN"/>
+              </w:rPr>
+              <w:t xml:space="preserve"> </w:t>
+            </w:r>
+            <w:proofErr w:type="spellStart"/>
+            <w:r>
+              <w:rPr>
+                <w:rFonts w:ascii="BRH Devanagari Extra" w:hAnsi="BRH Devanagari Extra" w:cs="BRH Devanagari Extra"/>
+                <w:color w:val="000000"/>
+                <w:sz w:val="40"/>
+                <w:szCs w:val="40"/>
+                <w:lang w:bidi="ml-IN"/>
+              </w:rPr>
+              <w:t>ÆÌuÉ</w:t>
+            </w:r>
+            <w:proofErr w:type="spellEnd"/>
+            <w:r>
+              <w:rPr>
+                <w:rFonts w:ascii="BRH Malayalam Extra" w:hAnsi="BRH Malayalam Extra" w:cs="BRH Devanagari Extra"/>
+                <w:b/>
+                <w:color w:val="000000"/>
+                <w:sz w:val="32"/>
+                <w:szCs w:val="40"/>
+                <w:lang w:bidi="ml-IN"/>
+              </w:rPr>
+              <w:t>–</w:t>
+            </w:r>
+            <w:proofErr w:type="spellStart"/>
+            <w:r>
+              <w:rPr>
+                <w:rFonts w:ascii="BRH Devanagari Extra" w:hAnsi="BRH Devanagari Extra" w:cs="BRH Devanagari Extra"/>
+                <w:color w:val="EE0000"/>
+                <w:sz w:val="40"/>
+                <w:szCs w:val="40"/>
+                <w:highlight w:val="yellow"/>
+                <w:lang w:bidi="ml-IN"/>
+              </w:rPr>
+              <w:t>iuÉÉ</w:t>
+            </w:r>
+            <w:proofErr w:type="spellEnd"/>
+            <w:r>
+              <w:rPr>
+                <w:rFonts w:ascii="BRH Devanagari Extra" w:hAnsi="BRH Devanagari Extra" w:cs="BRH Devanagari Extra"/>
+                <w:color w:val="000000"/>
+                <w:sz w:val="40"/>
+                <w:szCs w:val="40"/>
+                <w:lang w:bidi="ml-IN"/>
+              </w:rPr>
+              <w:t xml:space="preserve"> | </w:t>
+            </w:r>
+          </w:p>
+          <w:p>
+            <w:pPr>
+              <w:widowControl w:val="0"/>
+              <w:autoSpaceDE w:val="0"/>
+              <w:autoSpaceDN w:val="0"/>
+              <w:adjustRightInd w:val="0"/>
+              <w:spacing w:before="0" w:line="240" w:lineRule="auto"/>
+              <w:rPr>
+                <w:rFonts w:ascii="BRH Devanagari Extra" w:hAnsi="BRH Devanagari Extra" w:cs="BRH Devanagari Extra"/>
+                <w:color w:val="000000"/>
+                <w:sz w:val="40"/>
+                <w:szCs w:val="40"/>
+                <w:lang w:bidi="ml-IN"/>
+              </w:rPr>
+            </w:pPr>
+            <w:proofErr w:type="spellStart"/>
+            <w:r>
+              <w:rPr>
+                <w:rFonts w:ascii="BRH Devanagari Extra" w:hAnsi="BRH Devanagari Extra" w:cs="BRH Devanagari Extra"/>
+                <w:color w:val="000000"/>
+                <w:sz w:val="40"/>
+                <w:szCs w:val="40"/>
+                <w:lang w:bidi="ml-IN"/>
+              </w:rPr>
+              <w:t>ÌuÉ</w:t>
+            </w:r>
+            <w:proofErr w:type="spellEnd"/>
+            <w:r>
+              <w:rPr>
+                <w:rFonts w:ascii="BRH Malayalam Extra" w:hAnsi="BRH Malayalam Extra" w:cs="BRH Devanagari Extra"/>
+                <w:b/>
+                <w:color w:val="000000"/>
+                <w:sz w:val="32"/>
+                <w:szCs w:val="40"/>
+                <w:lang w:bidi="ml-IN"/>
+              </w:rPr>
+              <w:t>–</w:t>
+            </w:r>
+            <w:proofErr w:type="spellStart"/>
+            <w:r>
+              <w:rPr>
+                <w:rFonts w:ascii="BRH Devanagari Extra" w:hAnsi="BRH Devanagari Extra" w:cs="BRH Devanagari Extra"/>
+                <w:color w:val="EE0000"/>
+                <w:sz w:val="40"/>
+                <w:szCs w:val="40"/>
+                <w:highlight w:val="yellow"/>
+                <w:lang w:bidi="ml-IN"/>
+              </w:rPr>
+              <w:t>iuÉÉ</w:t>
+            </w:r>
+            <w:proofErr w:type="spellEnd"/>
+            <w:r>
+              <w:rPr>
+                <w:rFonts w:ascii="BRH Devanagari Extra" w:hAnsi="BRH Devanagari Extra" w:cs="BRH Devanagari Extra"/>
+                <w:color w:val="000000"/>
+                <w:sz w:val="40"/>
+                <w:szCs w:val="40"/>
+                <w:lang w:bidi="ml-IN"/>
+              </w:rPr>
+              <w:t xml:space="preserve"> </w:t>
+            </w:r>
+            <w:proofErr w:type="spellStart"/>
+            <w:r>
+              <w:rPr>
+                <w:rFonts w:ascii="BRH Devanagari Extra" w:hAnsi="BRH Devanagari Extra" w:cs="BRH Devanagari Extra"/>
+                <w:color w:val="000000"/>
+                <w:sz w:val="40"/>
+                <w:szCs w:val="40"/>
+                <w:lang w:bidi="ml-IN"/>
+              </w:rPr>
+              <w:t>aÉÉ</w:t>
+            </w:r>
+            <w:proofErr w:type="spellEnd"/>
+            <w:r>
+              <w:rPr>
+                <w:rFonts w:ascii="BRH Malayalam Extra" w:hAnsi="BRH Malayalam Extra" w:cs="BRH Devanagari Extra"/>
+                <w:b/>
+                <w:color w:val="000000"/>
+                <w:sz w:val="32"/>
+                <w:szCs w:val="40"/>
+                <w:lang w:bidi="ml-IN"/>
+              </w:rPr>
+              <w:t>–</w:t>
+            </w:r>
+            <w:proofErr w:type="spellStart"/>
+            <w:r>
+              <w:rPr>
+                <w:rFonts w:ascii="BRH Devanagari Extra" w:hAnsi="BRH Devanagari Extra" w:cs="BRH Devanagari Extra"/>
+                <w:color w:val="000000"/>
+                <w:sz w:val="40"/>
+                <w:szCs w:val="40"/>
+                <w:lang w:bidi="ml-IN"/>
+              </w:rPr>
+              <w:t>iÉÑqÉç</w:t>
+            </w:r>
+            <w:proofErr w:type="spellEnd"/>
+            <w:r>
+              <w:rPr>
+                <w:rFonts w:ascii="BRH Devanagari Extra" w:hAnsi="BRH Devanagari Extra" w:cs="BRH Devanagari Extra"/>
+                <w:color w:val="000000"/>
+                <w:sz w:val="40"/>
+                <w:szCs w:val="40"/>
+                <w:lang w:bidi="ml-IN"/>
+              </w:rPr>
+              <w:t xml:space="preserve"> |</w:t>
+            </w:r>
+          </w:p>
+        </w:tc>
+        <w:tc>
+          <w:tcPr>
+            <w:tcW w:w="5220" w:type="dxa"/>
+          </w:tcPr>
+          <w:p>
+            <w:pPr>
+              <w:widowControl w:val="0"/>
+              <w:autoSpaceDE w:val="0"/>
+              <w:autoSpaceDN w:val="0"/>
+              <w:adjustRightInd w:val="0"/>
+              <w:spacing w:line="252" w:lineRule="auto"/>
+              <w:rPr>
+                <w:rFonts w:cs="Arial"/>
+                <w:color w:val="000000"/>
+                <w:sz w:val="28"/>
+                <w:szCs w:val="28"/>
+                <w:lang w:bidi="ml-IN"/>
+              </w:rPr>
+            </w:pPr>
+            <w:proofErr w:type="spellStart"/>
+            <w:r>
+              <w:rPr>
+                <w:rFonts w:ascii="BRH Devanagari Extra" w:hAnsi="BRH Devanagari Extra" w:cs="BRH Devanagari Extra"/>
+                <w:color w:val="000000"/>
+                <w:sz w:val="40"/>
+                <w:szCs w:val="40"/>
+                <w:lang w:bidi="ml-IN"/>
+              </w:rPr>
+              <w:t>aÉÉ</w:t>
+            </w:r>
+            <w:proofErr w:type="spellEnd"/>
+            <w:r>
+              <w:rPr>
+                <w:rFonts w:ascii="BRH Malayalam Extra" w:hAnsi="BRH Malayalam Extra" w:cs="BRH Devanagari Extra"/>
+                <w:b/>
+                <w:color w:val="000000"/>
+                <w:sz w:val="32"/>
+                <w:szCs w:val="40"/>
+                <w:lang w:bidi="ml-IN"/>
+              </w:rPr>
+              <w:t>–</w:t>
+            </w:r>
+            <w:proofErr w:type="spellStart"/>
+            <w:r>
+              <w:rPr>
+                <w:rFonts w:ascii="BRH Devanagari Extra" w:hAnsi="BRH Devanagari Extra" w:cs="BRH Devanagari Extra"/>
+                <w:color w:val="000000"/>
+                <w:sz w:val="40"/>
+                <w:szCs w:val="40"/>
+                <w:lang w:bidi="ml-IN"/>
+              </w:rPr>
+              <w:t>iÉÑqÉç</w:t>
+            </w:r>
+            <w:proofErr w:type="spellEnd"/>
+            <w:r>
+              <w:rPr>
+                <w:rFonts w:ascii="BRH Devanagari Extra" w:hAnsi="BRH Devanagari Extra" w:cs="BRH Devanagari Extra"/>
+                <w:color w:val="000000"/>
+                <w:sz w:val="40"/>
+                <w:szCs w:val="40"/>
+                <w:lang w:bidi="ml-IN"/>
+              </w:rPr>
+              <w:t xml:space="preserve"> </w:t>
+            </w:r>
+            <w:proofErr w:type="spellStart"/>
+            <w:r>
+              <w:rPr>
+                <w:rFonts w:ascii="BRH Devanagari Extra" w:hAnsi="BRH Devanagari Extra" w:cs="BRH Devanagari Extra"/>
+                <w:color w:val="000000"/>
+                <w:sz w:val="40"/>
+                <w:szCs w:val="40"/>
+                <w:lang w:bidi="ml-IN"/>
+              </w:rPr>
+              <w:t>ÆÌuÉ</w:t>
+            </w:r>
+            <w:proofErr w:type="spellEnd"/>
+            <w:r>
+              <w:rPr>
+                <w:rFonts w:ascii="BRH Malayalam Extra" w:hAnsi="BRH Malayalam Extra" w:cs="BRH Devanagari Extra"/>
+                <w:b/>
+                <w:color w:val="000000"/>
+                <w:sz w:val="32"/>
+                <w:szCs w:val="40"/>
+                <w:lang w:bidi="ml-IN"/>
+              </w:rPr>
+              <w:t>–</w:t>
+            </w:r>
+            <w:proofErr w:type="spellStart"/>
+            <w:r>
+              <w:rPr>
+                <w:rFonts w:ascii="BRH Devanagari Extra" w:hAnsi="BRH Devanagari Extra" w:cs="BRH Devanagari Extra"/>
+                <w:color w:val="000000"/>
+                <w:sz w:val="40"/>
+                <w:szCs w:val="40"/>
+                <w:highlight w:val="yellow"/>
+                <w:lang w:bidi="ml-IN"/>
+              </w:rPr>
+              <w:t>iuÉÉ</w:t>
+            </w:r>
+            <w:proofErr w:type="spellEnd"/>
+            <w:r>
+              <w:rPr>
+                <w:rFonts w:ascii="BRH Devanagari Extra" w:hAnsi="BRH Devanagari Extra" w:cs="BRH Devanagari Extra"/>
+                <w:color w:val="000000"/>
+                <w:sz w:val="40"/>
+                <w:szCs w:val="40"/>
+                <w:lang w:bidi="ml-IN"/>
+              </w:rPr>
+              <w:t xml:space="preserve"> | </w:t>
+            </w:r>
+            <w:proofErr w:type="spellStart"/>
+            <w:r>
+              <w:rPr>
+                <w:rFonts w:cs="Arial"/>
+                <w:color w:val="000000"/>
+                <w:sz w:val="28"/>
+                <w:szCs w:val="28"/>
+                <w:highlight w:val="green"/>
+                <w:lang w:bidi="ml-IN"/>
+              </w:rPr>
+              <w:t>ttv</w:t>
+            </w:r>
+            <w:r>
+              <w:rPr>
+                <w:rFonts w:cs="Arial"/>
+                <w:color w:val="000000"/>
+                <w:sz w:val="28"/>
+                <w:szCs w:val="28"/>
+                <w:lang w:bidi="ml-IN"/>
+              </w:rPr>
+              <w:t>A</w:t>
+            </w:r>
+            <w:proofErr w:type="spellEnd"/>
+          </w:p>
+          <w:p>
+            <w:pPr>
+              <w:widowControl w:val="0"/>
+              <w:autoSpaceDE w:val="0"/>
+              <w:autoSpaceDN w:val="0"/>
+              <w:adjustRightInd w:val="0"/>
+              <w:spacing w:line="252" w:lineRule="auto"/>
+              <w:rPr>
+                <w:rFonts w:cs="Arial"/>
+                <w:color w:val="000000"/>
+                <w:sz w:val="28"/>
+                <w:szCs w:val="28"/>
+                <w:lang w:bidi="ml-IN"/>
+              </w:rPr>
+            </w:pPr>
+            <w:proofErr w:type="spellStart"/>
+            <w:r>
+              <w:rPr>
+                <w:rFonts w:ascii="BRH Devanagari Extra" w:hAnsi="BRH Devanagari Extra" w:cs="BRH Devanagari Extra"/>
+                <w:color w:val="000000"/>
+                <w:sz w:val="40"/>
+                <w:szCs w:val="40"/>
+                <w:lang w:bidi="ml-IN"/>
+              </w:rPr>
+              <w:t>ÌuÉ</w:t>
+            </w:r>
+            <w:proofErr w:type="spellEnd"/>
+            <w:r>
+              <w:rPr>
+                <w:rFonts w:ascii="BRH Malayalam Extra" w:hAnsi="BRH Malayalam Extra" w:cs="BRH Devanagari Extra"/>
+                <w:b/>
+                <w:color w:val="000000"/>
+                <w:sz w:val="32"/>
+                <w:szCs w:val="40"/>
+                <w:lang w:bidi="ml-IN"/>
+              </w:rPr>
+              <w:t>–</w:t>
+            </w:r>
+            <w:proofErr w:type="spellStart"/>
+            <w:r>
+              <w:rPr>
+                <w:rFonts w:ascii="BRH Devanagari Extra" w:hAnsi="BRH Devanagari Extra" w:cs="BRH Devanagari Extra"/>
+                <w:color w:val="000000"/>
+                <w:sz w:val="40"/>
+                <w:szCs w:val="40"/>
+                <w:highlight w:val="yellow"/>
+                <w:lang w:bidi="ml-IN"/>
+              </w:rPr>
+              <w:t>iuÉÉ</w:t>
+            </w:r>
+            <w:proofErr w:type="spellEnd"/>
+            <w:r>
+              <w:rPr>
+                <w:rFonts w:ascii="BRH Devanagari Extra" w:hAnsi="BRH Devanagari Extra" w:cs="BRH Devanagari Extra"/>
+                <w:color w:val="000000"/>
+                <w:sz w:val="40"/>
+                <w:szCs w:val="40"/>
+                <w:lang w:bidi="ml-IN"/>
+              </w:rPr>
+              <w:t xml:space="preserve"> </w:t>
+            </w:r>
+            <w:proofErr w:type="spellStart"/>
+            <w:r>
+              <w:rPr>
+                <w:rFonts w:ascii="BRH Devanagari Extra" w:hAnsi="BRH Devanagari Extra" w:cs="BRH Devanagari Extra"/>
+                <w:color w:val="000000"/>
+                <w:sz w:val="40"/>
+                <w:szCs w:val="40"/>
+                <w:lang w:bidi="ml-IN"/>
+              </w:rPr>
+              <w:t>aÉÉ</w:t>
+            </w:r>
+            <w:proofErr w:type="spellEnd"/>
+            <w:r>
+              <w:rPr>
+                <w:rFonts w:ascii="BRH Malayalam Extra" w:hAnsi="BRH Malayalam Extra" w:cs="BRH Devanagari Extra"/>
+                <w:b/>
+                <w:color w:val="000000"/>
+                <w:sz w:val="32"/>
+                <w:szCs w:val="40"/>
+                <w:lang w:bidi="ml-IN"/>
+              </w:rPr>
+              <w:t>–</w:t>
+            </w:r>
+            <w:proofErr w:type="spellStart"/>
+            <w:r>
+              <w:rPr>
+                <w:rFonts w:ascii="BRH Devanagari Extra" w:hAnsi="BRH Devanagari Extra" w:cs="BRH Devanagari Extra"/>
+                <w:color w:val="000000"/>
+                <w:sz w:val="40"/>
+                <w:szCs w:val="40"/>
+                <w:lang w:bidi="ml-IN"/>
+              </w:rPr>
+              <w:t>iÉÑqÉç</w:t>
+            </w:r>
+            <w:proofErr w:type="spellEnd"/>
+            <w:r>
+              <w:rPr>
+                <w:rFonts w:ascii="BRH Devanagari Extra" w:hAnsi="BRH Devanagari Extra" w:cs="BRH Devanagari Extra"/>
+                <w:color w:val="000000"/>
+                <w:sz w:val="40"/>
+                <w:szCs w:val="40"/>
+                <w:lang w:bidi="ml-IN"/>
+              </w:rPr>
+              <w:t xml:space="preserve"> |</w:t>
+            </w:r>
+            <w:r>
+              <w:rPr>
+                <w:rFonts w:ascii="BRH Devanagari Extra" w:hAnsi="BRH Devanagari Extra" w:cs="BRH Devanagari Extra"/>
+                <w:color w:val="000000"/>
+                <w:sz w:val="40"/>
+                <w:szCs w:val="40"/>
+                <w:lang w:bidi="ml-IN"/>
+              </w:rPr>
+              <w:t xml:space="preserve"> </w:t>
+            </w:r>
+            <w:proofErr w:type="spellStart"/>
+            <w:r>
+              <w:rPr>
+                <w:rFonts w:cs="Arial"/>
+                <w:color w:val="000000"/>
+                <w:sz w:val="28"/>
+                <w:szCs w:val="28"/>
+                <w:highlight w:val="green"/>
+                <w:lang w:bidi="ml-IN"/>
+              </w:rPr>
+              <w:t>ttv</w:t>
+            </w:r>
+            <w:r>
+              <w:rPr>
+                <w:rFonts w:cs="Arial"/>
+                <w:color w:val="000000"/>
+                <w:sz w:val="28"/>
+                <w:szCs w:val="28"/>
+                <w:lang w:bidi="ml-IN"/>
+              </w:rPr>
+              <w:t>A</w:t>
+            </w:r>
+            <w:proofErr w:type="spellEnd"/>
+          </w:p>
+          <w:p>
+            <w:pPr>
+              <w:widowControl w:val="0"/>
+              <w:autoSpaceDE w:val="0"/>
+              <w:autoSpaceDN w:val="0"/>
+              <w:adjustRightInd w:val="0"/>
+              <w:spacing w:before="0" w:line="240" w:lineRule="auto"/>
+              <w:rPr>
+                <w:rFonts w:ascii="BRH Devanagari Extra" w:hAnsi="BRH Devanagari Extra" w:cs="BRH Devanagari Extra"/>
+                <w:color w:val="000000"/>
+                <w:sz w:val="40"/>
+                <w:szCs w:val="40"/>
+                <w:lang w:bidi="ml-IN"/>
+              </w:rPr>
+            </w:pPr>
+          </w:p>
+        </w:tc>
+      </w:tr>
+      <w:tr>
+        <w:trPr>
+          <w:trHeight w:val="1389"/>
+        </w:trPr>
+        <w:tc>
+          <w:tcPr>
+            <w:tcW w:w="3877" w:type="dxa"/>
+          </w:tcPr>
+          <w:p>
+            <w:pPr>
+              <w:widowControl w:val="0"/>
+              <w:tabs>
+                <w:tab w:val="left" w:pos="993"/>
+              </w:tabs>
+              <w:autoSpaceDE w:val="0"/>
+              <w:autoSpaceDN w:val="0"/>
+              <w:adjustRightInd w:val="0"/>
+              <w:spacing w:before="0" w:line="252" w:lineRule="auto"/>
+              <w:ind w:right="297"/>
+              <w:rPr>
+                <w:rFonts w:cs="Arial"/>
+                <w:b/>
+                <w:sz w:val="28"/>
+                <w:szCs w:val="28"/>
+              </w:rPr>
+            </w:pPr>
+            <w:r>
+              <w:rPr>
+                <w:rFonts w:cs="Arial"/>
+                <w:b/>
+                <w:sz w:val="28"/>
+                <w:szCs w:val="28"/>
+              </w:rPr>
+              <w:t>T.S.6.6.</w:t>
+            </w:r>
+            <w:r>
+              <w:rPr>
+                <w:rFonts w:cs="Arial"/>
+                <w:b/>
+                <w:sz w:val="28"/>
+                <w:szCs w:val="28"/>
+              </w:rPr>
+              <w:t>4</w:t>
+            </w:r>
+            <w:r>
+              <w:rPr>
+                <w:rFonts w:cs="Arial"/>
+                <w:b/>
+                <w:sz w:val="28"/>
+                <w:szCs w:val="28"/>
+              </w:rPr>
+              <w:t>.</w:t>
+            </w:r>
+            <w:r>
+              <w:rPr>
+                <w:rFonts w:cs="Arial"/>
+                <w:b/>
+                <w:sz w:val="28"/>
+                <w:szCs w:val="28"/>
+              </w:rPr>
+              <w:t>4</w:t>
+            </w:r>
+            <w:r>
+              <w:rPr>
+                <w:rFonts w:cs="Arial"/>
+                <w:b/>
+                <w:sz w:val="28"/>
+                <w:szCs w:val="28"/>
+              </w:rPr>
+              <w:t xml:space="preserve"> – Kramam</w:t>
+            </w:r>
+          </w:p>
+          <w:p>
+            <w:pPr>
+              <w:widowControl w:val="0"/>
+              <w:tabs>
+                <w:tab w:val="left" w:pos="993"/>
+              </w:tabs>
+              <w:autoSpaceDE w:val="0"/>
+              <w:autoSpaceDN w:val="0"/>
+              <w:adjustRightInd w:val="0"/>
+              <w:spacing w:before="0" w:line="252" w:lineRule="auto"/>
+              <w:ind w:right="297"/>
+              <w:rPr>
+                <w:rFonts w:cs="Arial"/>
+                <w:b/>
+                <w:sz w:val="28"/>
+                <w:szCs w:val="28"/>
+              </w:rPr>
+            </w:pPr>
+            <w:r>
+              <w:rPr>
+                <w:rFonts w:cs="Arial"/>
+                <w:b/>
+                <w:sz w:val="28"/>
+                <w:szCs w:val="28"/>
+              </w:rPr>
+              <w:t xml:space="preserve">Krama Vaakyam No.– </w:t>
+            </w:r>
+            <w:r>
+              <w:rPr>
+                <w:rFonts w:cs="Arial"/>
+                <w:b/>
+                <w:sz w:val="28"/>
+                <w:szCs w:val="28"/>
+              </w:rPr>
+              <w:t>24,26,27</w:t>
+            </w:r>
+          </w:p>
+          <w:p>
+            <w:pPr>
+              <w:widowControl w:val="0"/>
+              <w:tabs>
+                <w:tab w:val="left" w:pos="993"/>
+              </w:tabs>
+              <w:autoSpaceDE w:val="0"/>
+              <w:autoSpaceDN w:val="0"/>
+              <w:adjustRightInd w:val="0"/>
+              <w:spacing w:before="0" w:line="252" w:lineRule="auto"/>
+              <w:ind w:right="297"/>
+              <w:rPr>
+                <w:rFonts w:cs="Arial"/>
+                <w:b/>
+                <w:sz w:val="28"/>
+                <w:szCs w:val="28"/>
+              </w:rPr>
+            </w:pPr>
+            <w:r>
+              <w:rPr>
+                <w:rFonts w:cs="Arial"/>
+                <w:b/>
+                <w:sz w:val="28"/>
+                <w:szCs w:val="28"/>
+              </w:rPr>
+              <w:t xml:space="preserve">Panchaati No. - </w:t>
+            </w:r>
+            <w:r>
+              <w:rPr>
+                <w:rFonts w:cs="Arial"/>
+                <w:b/>
+                <w:sz w:val="28"/>
+                <w:szCs w:val="28"/>
+              </w:rPr>
+              <w:t>17</w:t>
+            </w:r>
+          </w:p>
+        </w:tc>
+        <w:tc>
+          <w:tcPr>
+            <w:tcW w:w="4738" w:type="dxa"/>
+          </w:tcPr>
+          <w:p>
+            <w:pPr>
+              <w:widowControl w:val="0"/>
+              <w:autoSpaceDE w:val="0"/>
+              <w:autoSpaceDN w:val="0"/>
+              <w:adjustRightInd w:val="0"/>
+              <w:spacing w:before="0" w:line="240" w:lineRule="auto"/>
+              <w:rPr>
+                <w:rFonts w:ascii="BRH Devanagari Extra" w:hAnsi="BRH Devanagari Extra" w:cs="BRH Devanagari Extra"/>
+                <w:color w:val="000000"/>
+                <w:sz w:val="40"/>
+                <w:szCs w:val="40"/>
+                <w:lang w:bidi="ml-IN"/>
+              </w:rPr>
+            </w:pPr>
+            <w:r>
+              <w:rPr>
+                <w:rFonts w:ascii="BRH Devanagari Extra" w:hAnsi="BRH Devanagari Extra" w:cs="BRH Devanagari Extra"/>
+                <w:color w:val="000000"/>
+                <w:sz w:val="40"/>
+                <w:szCs w:val="40"/>
+                <w:lang w:bidi="ml-IN"/>
+              </w:rPr>
+              <w:t>E</w:t>
+            </w:r>
+            <w:r>
+              <w:rPr>
+                <w:rFonts w:ascii="BRH Malayalam Extra" w:hAnsi="BRH Malayalam Extra" w:cs="BRH Devanagari Extra"/>
+                <w:b/>
+                <w:color w:val="000000"/>
+                <w:sz w:val="32"/>
+                <w:szCs w:val="40"/>
+                <w:lang w:bidi="ml-IN"/>
+              </w:rPr>
+              <w:t>–</w:t>
+            </w:r>
+            <w:r>
+              <w:rPr>
+                <w:rFonts w:ascii="BRH Devanagari Extra" w:hAnsi="BRH Devanagari Extra" w:cs="BRH Devanagari Extra"/>
+                <w:color w:val="000000"/>
+                <w:sz w:val="40"/>
+                <w:szCs w:val="40"/>
+                <w:lang w:bidi="ml-IN"/>
+              </w:rPr>
+              <w:t>mÉ</w:t>
+            </w:r>
+            <w:r>
+              <w:rPr>
+                <w:rFonts w:ascii="BRH Malayalam Extra" w:hAnsi="BRH Malayalam Extra" w:cs="BRH Devanagari Extra"/>
+                <w:b/>
+                <w:color w:val="000000"/>
+                <w:sz w:val="32"/>
+                <w:szCs w:val="40"/>
+                <w:lang w:bidi="ml-IN"/>
+              </w:rPr>
+              <w:t>–</w:t>
+            </w:r>
+            <w:proofErr w:type="spellStart"/>
+            <w:r>
+              <w:rPr>
+                <w:rFonts w:ascii="BRH Devanagari Extra" w:hAnsi="BRH Devanagari Extra" w:cs="BRH Devanagari Extra"/>
+                <w:color w:val="000000"/>
+                <w:sz w:val="40"/>
+                <w:szCs w:val="40"/>
+                <w:lang w:bidi="ml-IN"/>
+              </w:rPr>
+              <w:t>zÉrÉå</w:t>
+            </w:r>
+            <w:proofErr w:type="spellEnd"/>
+            <w:r>
+              <w:rPr>
+                <w:rFonts w:ascii="BRH Malayalam Extra" w:hAnsi="BRH Malayalam Extra" w:cs="BRH Devanagari Extra"/>
+                <w:b/>
+                <w:color w:val="000000"/>
+                <w:sz w:val="32"/>
+                <w:szCs w:val="40"/>
+                <w:lang w:bidi="ml-IN"/>
+              </w:rPr>
+              <w:t>–</w:t>
+            </w:r>
+            <w:r>
+              <w:rPr>
+                <w:rFonts w:ascii="BRH Devanagari Extra" w:hAnsi="BRH Devanagari Extra" w:cs="BRH Devanagari Extra"/>
+                <w:color w:val="000000"/>
+                <w:sz w:val="40"/>
+                <w:szCs w:val="40"/>
+                <w:lang w:bidi="ml-IN"/>
+              </w:rPr>
+              <w:t xml:space="preserve"> </w:t>
+            </w:r>
+            <w:proofErr w:type="spellStart"/>
+            <w:r>
+              <w:rPr>
+                <w:rFonts w:ascii="BRH Devanagari Extra" w:hAnsi="BRH Devanagari Extra" w:cs="BRH Devanagari Extra"/>
+                <w:color w:val="000000"/>
+                <w:sz w:val="40"/>
+                <w:szCs w:val="40"/>
+                <w:lang w:bidi="ml-IN"/>
+              </w:rPr>
+              <w:t>pÉëÉiÉ×þurÉÉmÉlÉÑ</w:t>
+            </w:r>
+            <w:r>
+              <w:rPr>
+                <w:rFonts w:ascii="BRH Devanagari Extra" w:hAnsi="BRH Devanagari Extra" w:cs="BRH Devanagari Extra"/>
+                <w:color w:val="EE0000"/>
+                <w:sz w:val="40"/>
+                <w:szCs w:val="40"/>
+                <w:highlight w:val="yellow"/>
+                <w:lang w:bidi="ml-IN"/>
+              </w:rPr>
+              <w:t>irÉæ</w:t>
+            </w:r>
+            <w:proofErr w:type="spellEnd"/>
+            <w:r>
+              <w:rPr>
+                <w:rFonts w:ascii="BRH Devanagari Extra" w:hAnsi="BRH Devanagari Extra" w:cs="BRH Devanagari Extra"/>
+                <w:color w:val="EE0000"/>
+                <w:sz w:val="40"/>
+                <w:szCs w:val="40"/>
+                <w:lang w:bidi="ml-IN"/>
+              </w:rPr>
+              <w:t xml:space="preserve"> </w:t>
+            </w:r>
+            <w:r>
+              <w:rPr>
+                <w:rFonts w:ascii="BRH Devanagari Extra" w:hAnsi="BRH Devanagari Extra" w:cs="BRH Devanagari Extra"/>
+                <w:color w:val="000000"/>
+                <w:sz w:val="40"/>
+                <w:szCs w:val="40"/>
+                <w:lang w:bidi="ml-IN"/>
+              </w:rPr>
+              <w:t>|</w:t>
+            </w:r>
+          </w:p>
+          <w:p>
+            <w:pPr>
+              <w:widowControl w:val="0"/>
+              <w:autoSpaceDE w:val="0"/>
+              <w:autoSpaceDN w:val="0"/>
+              <w:adjustRightInd w:val="0"/>
+              <w:spacing w:before="0" w:line="240" w:lineRule="auto"/>
+              <w:rPr>
+                <w:rFonts w:ascii="BRH Malayalam Extra" w:eastAsia="Times New Roman" w:hAnsi="BRH Malayalam Extra" w:cs="BRH Malayalam Extra"/>
+                <w:color w:val="000000"/>
+                <w:sz w:val="40"/>
+                <w:szCs w:val="40"/>
+                <w:lang w:val="en-IN" w:eastAsia="en-IN" w:bidi="ml-IN"/>
+              </w:rPr>
+            </w:pPr>
+            <w:proofErr w:type="spellStart"/>
+            <w:r>
+              <w:rPr>
+                <w:rFonts w:ascii="BRH Devanagari Extra" w:hAnsi="BRH Devanagari Extra" w:cs="BRH Devanagari Extra"/>
+                <w:color w:val="000000"/>
+                <w:sz w:val="40"/>
+                <w:szCs w:val="40"/>
+                <w:lang w:bidi="ml-IN"/>
+              </w:rPr>
+              <w:t>pÉëÉiÉ×þurÉÉmÉlÉÑ</w:t>
+            </w:r>
+            <w:r>
+              <w:rPr>
+                <w:rFonts w:ascii="BRH Devanagari Extra" w:hAnsi="BRH Devanagari Extra" w:cs="BRH Devanagari Extra"/>
+                <w:color w:val="EE0000"/>
+                <w:sz w:val="40"/>
+                <w:szCs w:val="40"/>
+                <w:highlight w:val="yellow"/>
+                <w:lang w:bidi="ml-IN"/>
+              </w:rPr>
+              <w:t>irÉæ</w:t>
+            </w:r>
+            <w:proofErr w:type="spellEnd"/>
+            <w:r>
+              <w:rPr>
+                <w:rFonts w:ascii="BRH Malayalam Extra" w:hAnsi="BRH Malayalam Extra" w:cs="BRH Devanagari Extra"/>
+                <w:b/>
+                <w:color w:val="EE0000"/>
+                <w:sz w:val="32"/>
+                <w:szCs w:val="40"/>
+                <w:highlight w:val="yellow"/>
+                <w:lang w:bidi="ml-IN"/>
+              </w:rPr>
+              <w:t>–</w:t>
+            </w:r>
+            <w:r>
+              <w:rPr>
+                <w:rFonts w:ascii="BRH Devanagari Extra" w:hAnsi="BRH Devanagari Extra" w:cs="BRH Devanagari Extra"/>
+                <w:color w:val="000000"/>
+                <w:sz w:val="40"/>
+                <w:szCs w:val="40"/>
+                <w:lang w:bidi="ml-IN"/>
+              </w:rPr>
+              <w:t xml:space="preserve"> </w:t>
+            </w:r>
+            <w:proofErr w:type="spellStart"/>
+            <w:r>
+              <w:rPr>
+                <w:rFonts w:ascii="BRH Devanagari Extra" w:hAnsi="BRH Devanagari Extra" w:cs="BRH Devanagari Extra"/>
+                <w:color w:val="000000"/>
+                <w:sz w:val="40"/>
+                <w:szCs w:val="40"/>
+                <w:lang w:bidi="ml-IN"/>
+              </w:rPr>
+              <w:t>xÉuÉåïÿ</w:t>
+            </w:r>
+            <w:proofErr w:type="spellEnd"/>
+            <w:r>
+              <w:rPr>
+                <w:rFonts w:ascii="BRH Devanagari Extra" w:hAnsi="BRH Devanagari Extra" w:cs="BRH Devanagari Extra"/>
+                <w:color w:val="000000"/>
+                <w:sz w:val="40"/>
+                <w:szCs w:val="40"/>
+                <w:lang w:bidi="ml-IN"/>
+              </w:rPr>
+              <w:t xml:space="preserve"> | </w:t>
+            </w:r>
+            <w:proofErr w:type="spellStart"/>
+            <w:r>
+              <w:rPr>
+                <w:rFonts w:ascii="BRH Devanagari Extra" w:hAnsi="BRH Devanagari Extra" w:cs="BRH Devanagari Extra"/>
+                <w:color w:val="000000"/>
+                <w:sz w:val="40"/>
+                <w:szCs w:val="40"/>
+                <w:lang w:bidi="ml-IN"/>
+              </w:rPr>
+              <w:t>pÉëÉiÉ×þurÉÉmÉlÉ</w:t>
+            </w:r>
+            <w:r>
+              <w:rPr>
+                <w:rFonts w:ascii="BRH Devanagari Extra" w:hAnsi="BRH Devanagari Extra" w:cs="BRH Devanagari Extra"/>
+                <w:color w:val="000000"/>
+                <w:sz w:val="40"/>
+                <w:szCs w:val="40"/>
+                <w:highlight w:val="yellow"/>
+                <w:lang w:bidi="ml-IN"/>
+              </w:rPr>
+              <w:t>Ñ</w:t>
+            </w:r>
+            <w:r>
+              <w:rPr>
+                <w:rFonts w:ascii="BRH Devanagari Extra" w:hAnsi="BRH Devanagari Extra" w:cs="BRH Devanagari Extra"/>
+                <w:color w:val="EE0000"/>
+                <w:sz w:val="40"/>
+                <w:szCs w:val="40"/>
+                <w:highlight w:val="yellow"/>
+                <w:lang w:bidi="ml-IN"/>
+              </w:rPr>
+              <w:t>irÉÉ</w:t>
+            </w:r>
+            <w:proofErr w:type="spellEnd"/>
+            <w:r>
+              <w:rPr>
+                <w:rFonts w:ascii="BRH Malayalam Extra" w:hAnsi="BRH Malayalam Extra" w:cs="BRH Devanagari Extra"/>
+                <w:b/>
+                <w:color w:val="EE0000"/>
+                <w:sz w:val="32"/>
+                <w:szCs w:val="40"/>
+                <w:highlight w:val="yellow"/>
+                <w:lang w:bidi="ml-IN"/>
+              </w:rPr>
+              <w:t>–</w:t>
+            </w:r>
+            <w:r>
+              <w:rPr>
+                <w:rFonts w:ascii="BRH Devanagari Extra" w:hAnsi="BRH Devanagari Extra" w:cs="BRH Devanagari Extra"/>
+                <w:color w:val="000000"/>
+                <w:sz w:val="40"/>
+                <w:szCs w:val="40"/>
+                <w:lang w:bidi="ml-IN"/>
+              </w:rPr>
+              <w:t xml:space="preserve"> </w:t>
+            </w:r>
+            <w:proofErr w:type="spellStart"/>
+            <w:r>
+              <w:rPr>
+                <w:rFonts w:ascii="BRH Devanagari Extra" w:hAnsi="BRH Devanagari Extra" w:cs="BRH Devanagari Extra"/>
+                <w:color w:val="000000"/>
+                <w:sz w:val="40"/>
+                <w:szCs w:val="40"/>
+                <w:lang w:bidi="ml-IN"/>
+              </w:rPr>
+              <w:t>CÌiÉ</w:t>
+            </w:r>
+            <w:proofErr w:type="spellEnd"/>
+            <w:r>
+              <w:rPr>
+                <w:rFonts w:ascii="BRH Malayalam Extra" w:hAnsi="BRH Malayalam Extra" w:cs="BRH Devanagari Extra"/>
+                <w:b/>
+                <w:color w:val="000000"/>
+                <w:sz w:val="32"/>
+                <w:szCs w:val="40"/>
+                <w:lang w:bidi="ml-IN"/>
+              </w:rPr>
+              <w:t>–</w:t>
+            </w:r>
+            <w:r>
+              <w:rPr>
+                <w:rFonts w:ascii="BRH Devanagari Extra" w:hAnsi="BRH Devanagari Extra" w:cs="BRH Devanagari Extra"/>
+                <w:color w:val="000000"/>
+                <w:sz w:val="40"/>
+                <w:szCs w:val="40"/>
+                <w:lang w:bidi="ml-IN"/>
+              </w:rPr>
+              <w:t xml:space="preserve"> </w:t>
+            </w:r>
+            <w:proofErr w:type="spellStart"/>
+            <w:r>
+              <w:rPr>
+                <w:rFonts w:ascii="BRH Devanagari Extra" w:hAnsi="BRH Devanagari Extra" w:cs="BRH Devanagari Extra"/>
+                <w:color w:val="000000"/>
+                <w:sz w:val="40"/>
+                <w:szCs w:val="40"/>
+                <w:lang w:bidi="ml-IN"/>
+              </w:rPr>
+              <w:t>pÉëÉiÉ×þurÉ</w:t>
+            </w:r>
+            <w:proofErr w:type="spellEnd"/>
+            <w:r>
+              <w:rPr>
+                <w:rFonts w:ascii="BRH Devanagari Extra" w:hAnsi="BRH Devanagari Extra" w:cs="BRH Devanagari Extra"/>
+                <w:color w:val="000000"/>
+                <w:sz w:val="40"/>
+                <w:szCs w:val="40"/>
+                <w:lang w:bidi="ml-IN"/>
+              </w:rPr>
+              <w:t xml:space="preserve"> - A</w:t>
+            </w:r>
+            <w:r>
+              <w:rPr>
+                <w:rFonts w:ascii="BRH Malayalam Extra" w:hAnsi="BRH Malayalam Extra" w:cs="BRH Devanagari Extra"/>
+                <w:b/>
+                <w:color w:val="000000"/>
+                <w:sz w:val="32"/>
+                <w:szCs w:val="40"/>
+                <w:lang w:bidi="ml-IN"/>
+              </w:rPr>
+              <w:t>–</w:t>
+            </w:r>
+            <w:r>
+              <w:rPr>
+                <w:rFonts w:ascii="BRH Devanagari Extra" w:hAnsi="BRH Devanagari Extra" w:cs="BRH Devanagari Extra"/>
+                <w:color w:val="000000"/>
+                <w:sz w:val="40"/>
+                <w:szCs w:val="40"/>
+                <w:lang w:bidi="ml-IN"/>
+              </w:rPr>
+              <w:t>mÉ</w:t>
+            </w:r>
+            <w:r>
+              <w:rPr>
+                <w:rFonts w:ascii="BRH Malayalam Extra" w:hAnsi="BRH Malayalam Extra" w:cs="BRH Devanagari Extra"/>
+                <w:b/>
+                <w:color w:val="000000"/>
+                <w:sz w:val="32"/>
+                <w:szCs w:val="40"/>
+                <w:lang w:bidi="ml-IN"/>
+              </w:rPr>
+              <w:t>–</w:t>
+            </w:r>
+            <w:proofErr w:type="spellStart"/>
+            <w:r>
+              <w:rPr>
+                <w:rFonts w:ascii="BRH Devanagari Extra" w:hAnsi="BRH Devanagari Extra" w:cs="BRH Devanagari Extra"/>
+                <w:color w:val="000000"/>
+                <w:sz w:val="40"/>
+                <w:szCs w:val="40"/>
+                <w:lang w:bidi="ml-IN"/>
+              </w:rPr>
+              <w:t>lÉÑ</w:t>
+            </w:r>
+            <w:proofErr w:type="spellEnd"/>
+            <w:r>
+              <w:rPr>
+                <w:rFonts w:ascii="BRH Malayalam Extra" w:hAnsi="BRH Malayalam Extra" w:cs="BRH Devanagari Extra"/>
+                <w:b/>
+                <w:color w:val="000000"/>
+                <w:sz w:val="32"/>
+                <w:szCs w:val="40"/>
+                <w:lang w:bidi="ml-IN"/>
+              </w:rPr>
+              <w:t>–</w:t>
+            </w:r>
+            <w:proofErr w:type="spellStart"/>
+            <w:r>
+              <w:rPr>
+                <w:rFonts w:ascii="BRH Devanagari Extra" w:hAnsi="BRH Devanagari Extra" w:cs="BRH Devanagari Extra"/>
+                <w:color w:val="EE0000"/>
+                <w:sz w:val="40"/>
+                <w:szCs w:val="40"/>
+                <w:highlight w:val="yellow"/>
+                <w:lang w:bidi="ml-IN"/>
+              </w:rPr>
+              <w:t>irÉæ</w:t>
+            </w:r>
+            <w:proofErr w:type="spellEnd"/>
+            <w:r>
+              <w:rPr>
+                <w:rFonts w:ascii="BRH Malayalam Extra" w:hAnsi="BRH Malayalam Extra" w:cs="BRH Devanagari Extra"/>
+                <w:b/>
+                <w:color w:val="EE0000"/>
+                <w:sz w:val="32"/>
+                <w:szCs w:val="40"/>
+                <w:highlight w:val="yellow"/>
+                <w:lang w:bidi="ml-IN"/>
+              </w:rPr>
+              <w:t>–</w:t>
+            </w:r>
+            <w:r>
+              <w:rPr>
+                <w:rFonts w:ascii="BRH Devanagari Extra" w:hAnsi="BRH Devanagari Extra" w:cs="BRH Devanagari Extra"/>
+                <w:color w:val="000000"/>
+                <w:sz w:val="40"/>
+                <w:szCs w:val="40"/>
+                <w:lang w:bidi="ml-IN"/>
+              </w:rPr>
+              <w:t xml:space="preserve"> |</w:t>
+            </w:r>
+          </w:p>
+        </w:tc>
+        <w:tc>
+          <w:tcPr>
+            <w:tcW w:w="5220" w:type="dxa"/>
+          </w:tcPr>
+          <w:p>
+            <w:pPr>
+              <w:widowControl w:val="0"/>
+              <w:autoSpaceDE w:val="0"/>
+              <w:autoSpaceDN w:val="0"/>
+              <w:adjustRightInd w:val="0"/>
+              <w:spacing w:before="0" w:line="240" w:lineRule="auto"/>
+              <w:rPr>
+                <w:rFonts w:ascii="BRH Devanagari Extra" w:hAnsi="BRH Devanagari Extra" w:cs="BRH Devanagari Extra"/>
+                <w:color w:val="000000"/>
+                <w:sz w:val="40"/>
+                <w:szCs w:val="40"/>
+                <w:lang w:bidi="ml-IN"/>
+              </w:rPr>
+            </w:pPr>
+            <w:r>
+              <w:rPr>
+                <w:rFonts w:ascii="BRH Devanagari Extra" w:hAnsi="BRH Devanagari Extra" w:cs="BRH Devanagari Extra"/>
+                <w:color w:val="000000"/>
+                <w:sz w:val="40"/>
+                <w:szCs w:val="40"/>
+                <w:lang w:bidi="ml-IN"/>
+              </w:rPr>
+              <w:t>E</w:t>
+            </w:r>
+            <w:r>
+              <w:rPr>
+                <w:rFonts w:ascii="BRH Malayalam Extra" w:hAnsi="BRH Malayalam Extra" w:cs="BRH Devanagari Extra"/>
+                <w:b/>
+                <w:color w:val="000000"/>
+                <w:sz w:val="32"/>
+                <w:szCs w:val="40"/>
+                <w:lang w:bidi="ml-IN"/>
+              </w:rPr>
+              <w:t>–</w:t>
+            </w:r>
+            <w:r>
+              <w:rPr>
+                <w:rFonts w:ascii="BRH Devanagari Extra" w:hAnsi="BRH Devanagari Extra" w:cs="BRH Devanagari Extra"/>
+                <w:color w:val="000000"/>
+                <w:sz w:val="40"/>
+                <w:szCs w:val="40"/>
+                <w:lang w:bidi="ml-IN"/>
+              </w:rPr>
+              <w:t>mÉ</w:t>
+            </w:r>
+            <w:r>
+              <w:rPr>
+                <w:rFonts w:ascii="BRH Malayalam Extra" w:hAnsi="BRH Malayalam Extra" w:cs="BRH Devanagari Extra"/>
+                <w:b/>
+                <w:color w:val="000000"/>
+                <w:sz w:val="32"/>
+                <w:szCs w:val="40"/>
+                <w:lang w:bidi="ml-IN"/>
+              </w:rPr>
+              <w:t>–</w:t>
+            </w:r>
+            <w:proofErr w:type="spellStart"/>
+            <w:r>
+              <w:rPr>
+                <w:rFonts w:ascii="BRH Devanagari Extra" w:hAnsi="BRH Devanagari Extra" w:cs="BRH Devanagari Extra"/>
+                <w:color w:val="000000"/>
+                <w:sz w:val="40"/>
+                <w:szCs w:val="40"/>
+                <w:lang w:bidi="ml-IN"/>
+              </w:rPr>
+              <w:t>zÉrÉå</w:t>
+            </w:r>
+            <w:proofErr w:type="spellEnd"/>
+            <w:r>
+              <w:rPr>
+                <w:rFonts w:ascii="BRH Malayalam Extra" w:hAnsi="BRH Malayalam Extra" w:cs="BRH Devanagari Extra"/>
+                <w:b/>
+                <w:color w:val="000000"/>
+                <w:sz w:val="32"/>
+                <w:szCs w:val="40"/>
+                <w:lang w:bidi="ml-IN"/>
+              </w:rPr>
+              <w:t>–</w:t>
+            </w:r>
+            <w:r>
+              <w:rPr>
+                <w:rFonts w:ascii="BRH Devanagari Extra" w:hAnsi="BRH Devanagari Extra" w:cs="BRH Devanagari Extra"/>
+                <w:color w:val="000000"/>
+                <w:sz w:val="40"/>
+                <w:szCs w:val="40"/>
+                <w:lang w:bidi="ml-IN"/>
+              </w:rPr>
+              <w:t xml:space="preserve"> </w:t>
+            </w:r>
+            <w:proofErr w:type="spellStart"/>
+            <w:r>
+              <w:rPr>
+                <w:rFonts w:ascii="BRH Devanagari Extra" w:hAnsi="BRH Devanagari Extra" w:cs="BRH Devanagari Extra"/>
+                <w:color w:val="000000"/>
+                <w:sz w:val="40"/>
+                <w:szCs w:val="40"/>
+                <w:lang w:bidi="ml-IN"/>
+              </w:rPr>
+              <w:t>pÉëÉiÉ×þurÉÉmÉlÉÑ</w:t>
+            </w:r>
+            <w:r>
+              <w:rPr>
+                <w:rFonts w:ascii="BRH Devanagari Extra" w:hAnsi="BRH Devanagari Extra" w:cs="BRH Devanagari Extra"/>
+                <w:color w:val="EE0000"/>
+                <w:sz w:val="40"/>
+                <w:szCs w:val="40"/>
+                <w:highlight w:val="yellow"/>
+                <w:lang w:bidi="ml-IN"/>
+              </w:rPr>
+              <w:t>irÉæ</w:t>
+            </w:r>
+            <w:proofErr w:type="spellEnd"/>
+            <w:r>
+              <w:rPr>
+                <w:rFonts w:ascii="BRH Devanagari Extra" w:hAnsi="BRH Devanagari Extra" w:cs="BRH Devanagari Extra"/>
+                <w:color w:val="EE0000"/>
+                <w:sz w:val="40"/>
+                <w:szCs w:val="40"/>
+                <w:lang w:bidi="ml-IN"/>
+              </w:rPr>
+              <w:t xml:space="preserve"> </w:t>
+            </w:r>
+            <w:r>
+              <w:rPr>
+                <w:rFonts w:ascii="BRH Devanagari Extra" w:hAnsi="BRH Devanagari Extra" w:cs="BRH Devanagari Extra"/>
+                <w:color w:val="000000"/>
+                <w:sz w:val="40"/>
+                <w:szCs w:val="40"/>
+                <w:lang w:bidi="ml-IN"/>
+              </w:rPr>
+              <w:t>|</w:t>
+            </w:r>
+            <w:r>
+              <w:rPr>
+                <w:rFonts w:ascii="BRH Devanagari Extra" w:hAnsi="BRH Devanagari Extra" w:cs="BRH Devanagari Extra"/>
+                <w:color w:val="000000"/>
+                <w:sz w:val="40"/>
+                <w:szCs w:val="40"/>
+                <w:lang w:bidi="ml-IN"/>
+              </w:rPr>
+              <w:t xml:space="preserve"> </w:t>
+            </w:r>
+            <w:proofErr w:type="spellStart"/>
+            <w:r>
+              <w:rPr>
+                <w:rFonts w:cs="Arial"/>
+                <w:color w:val="000000"/>
+                <w:sz w:val="28"/>
+                <w:szCs w:val="28"/>
+                <w:lang w:bidi="ml-IN"/>
+              </w:rPr>
+              <w:t>ttyai</w:t>
+            </w:r>
+            <w:proofErr w:type="spellEnd"/>
+          </w:p>
+          <w:p>
+            <w:pPr>
+              <w:widowControl w:val="0"/>
+              <w:autoSpaceDE w:val="0"/>
+              <w:autoSpaceDN w:val="0"/>
+              <w:adjustRightInd w:val="0"/>
+              <w:spacing w:before="0" w:line="240" w:lineRule="auto"/>
+              <w:rPr>
+                <w:rFonts w:ascii="BRH Malayalam Extra" w:eastAsia="Times New Roman" w:hAnsi="BRH Malayalam Extra" w:cs="BRH Malayalam Extra"/>
+                <w:color w:val="000000"/>
+                <w:sz w:val="40"/>
+                <w:szCs w:val="40"/>
+                <w:lang w:val="en-IN" w:eastAsia="en-IN" w:bidi="ml-IN"/>
+              </w:rPr>
+            </w:pPr>
+            <w:proofErr w:type="spellStart"/>
+            <w:r>
+              <w:rPr>
+                <w:rFonts w:ascii="BRH Devanagari Extra" w:hAnsi="BRH Devanagari Extra" w:cs="BRH Devanagari Extra"/>
+                <w:color w:val="000000"/>
+                <w:sz w:val="40"/>
+                <w:szCs w:val="40"/>
+                <w:lang w:bidi="ml-IN"/>
+              </w:rPr>
+              <w:t>pÉëÉiÉ×þurÉÉmÉlÉÑ</w:t>
+            </w:r>
+            <w:r>
+              <w:rPr>
+                <w:rFonts w:ascii="BRH Devanagari Extra" w:hAnsi="BRH Devanagari Extra" w:cs="BRH Devanagari Extra"/>
+                <w:color w:val="EE0000"/>
+                <w:sz w:val="40"/>
+                <w:szCs w:val="40"/>
+                <w:highlight w:val="yellow"/>
+                <w:lang w:bidi="ml-IN"/>
+              </w:rPr>
+              <w:t>irÉæ</w:t>
+            </w:r>
+            <w:proofErr w:type="spellEnd"/>
+            <w:r>
+              <w:rPr>
+                <w:rFonts w:ascii="BRH Malayalam Extra" w:hAnsi="BRH Malayalam Extra" w:cs="BRH Devanagari Extra"/>
+                <w:b/>
+                <w:color w:val="EE0000"/>
+                <w:sz w:val="32"/>
+                <w:szCs w:val="40"/>
+                <w:highlight w:val="yellow"/>
+                <w:lang w:bidi="ml-IN"/>
+              </w:rPr>
+              <w:t>–</w:t>
+            </w:r>
+            <w:r>
+              <w:rPr>
+                <w:rFonts w:ascii="BRH Devanagari Extra" w:hAnsi="BRH Devanagari Extra" w:cs="BRH Devanagari Extra"/>
+                <w:color w:val="000000"/>
+                <w:sz w:val="40"/>
+                <w:szCs w:val="40"/>
+                <w:lang w:bidi="ml-IN"/>
+              </w:rPr>
+              <w:t xml:space="preserve"> </w:t>
+            </w:r>
+            <w:proofErr w:type="spellStart"/>
+            <w:r>
+              <w:rPr>
+                <w:rFonts w:ascii="BRH Devanagari Extra" w:hAnsi="BRH Devanagari Extra" w:cs="BRH Devanagari Extra"/>
+                <w:color w:val="000000"/>
+                <w:sz w:val="40"/>
+                <w:szCs w:val="40"/>
+                <w:lang w:bidi="ml-IN"/>
+              </w:rPr>
+              <w:t>xÉuÉåïÿ</w:t>
+            </w:r>
+            <w:proofErr w:type="spellEnd"/>
+            <w:r>
+              <w:rPr>
+                <w:rFonts w:ascii="BRH Devanagari Extra" w:hAnsi="BRH Devanagari Extra" w:cs="BRH Devanagari Extra"/>
+                <w:color w:val="000000"/>
+                <w:sz w:val="40"/>
+                <w:szCs w:val="40"/>
+                <w:lang w:bidi="ml-IN"/>
+              </w:rPr>
+              <w:t xml:space="preserve"> | </w:t>
+            </w:r>
+            <w:proofErr w:type="spellStart"/>
+            <w:r>
+              <w:rPr>
+                <w:rFonts w:ascii="BRH Devanagari Extra" w:hAnsi="BRH Devanagari Extra" w:cs="BRH Devanagari Extra"/>
+                <w:color w:val="000000"/>
+                <w:sz w:val="40"/>
+                <w:szCs w:val="40"/>
+                <w:lang w:bidi="ml-IN"/>
+              </w:rPr>
+              <w:t>pÉëÉiÉ×þurÉÉmÉlÉ</w:t>
+            </w:r>
+            <w:r>
+              <w:rPr>
+                <w:rFonts w:ascii="BRH Devanagari Extra" w:hAnsi="BRH Devanagari Extra" w:cs="BRH Devanagari Extra"/>
+                <w:color w:val="000000"/>
+                <w:sz w:val="40"/>
+                <w:szCs w:val="40"/>
+                <w:highlight w:val="yellow"/>
+                <w:lang w:bidi="ml-IN"/>
+              </w:rPr>
+              <w:t>Ñ</w:t>
+            </w:r>
+            <w:r>
+              <w:rPr>
+                <w:rFonts w:ascii="BRH Devanagari Extra" w:hAnsi="BRH Devanagari Extra" w:cs="BRH Devanagari Extra"/>
+                <w:color w:val="EE0000"/>
+                <w:sz w:val="40"/>
+                <w:szCs w:val="40"/>
+                <w:highlight w:val="yellow"/>
+                <w:lang w:bidi="ml-IN"/>
+              </w:rPr>
+              <w:t>irÉÉ</w:t>
+            </w:r>
+            <w:proofErr w:type="spellEnd"/>
+            <w:r>
+              <w:rPr>
+                <w:rFonts w:ascii="BRH Malayalam Extra" w:hAnsi="BRH Malayalam Extra" w:cs="BRH Devanagari Extra"/>
+                <w:b/>
+                <w:color w:val="EE0000"/>
+                <w:sz w:val="32"/>
+                <w:szCs w:val="40"/>
+                <w:highlight w:val="yellow"/>
+                <w:lang w:bidi="ml-IN"/>
+              </w:rPr>
+              <w:t>–</w:t>
+            </w:r>
+            <w:r>
+              <w:rPr>
+                <w:rFonts w:ascii="BRH Devanagari Extra" w:hAnsi="BRH Devanagari Extra" w:cs="BRH Devanagari Extra"/>
+                <w:color w:val="000000"/>
+                <w:sz w:val="40"/>
+                <w:szCs w:val="40"/>
+                <w:lang w:bidi="ml-IN"/>
+              </w:rPr>
+              <w:t xml:space="preserve"> </w:t>
+            </w:r>
+            <w:proofErr w:type="spellStart"/>
+            <w:r>
+              <w:rPr>
+                <w:rFonts w:ascii="BRH Devanagari Extra" w:hAnsi="BRH Devanagari Extra" w:cs="BRH Devanagari Extra"/>
+                <w:color w:val="000000"/>
+                <w:sz w:val="40"/>
+                <w:szCs w:val="40"/>
+                <w:lang w:bidi="ml-IN"/>
+              </w:rPr>
+              <w:t>CÌiÉ</w:t>
+            </w:r>
+            <w:proofErr w:type="spellEnd"/>
+            <w:r>
+              <w:rPr>
+                <w:rFonts w:ascii="BRH Malayalam Extra" w:hAnsi="BRH Malayalam Extra" w:cs="BRH Devanagari Extra"/>
+                <w:b/>
+                <w:color w:val="000000"/>
+                <w:sz w:val="32"/>
+                <w:szCs w:val="40"/>
+                <w:lang w:bidi="ml-IN"/>
+              </w:rPr>
+              <w:t>–</w:t>
+            </w:r>
+            <w:r>
+              <w:rPr>
+                <w:rFonts w:ascii="BRH Devanagari Extra" w:hAnsi="BRH Devanagari Extra" w:cs="BRH Devanagari Extra"/>
+                <w:color w:val="000000"/>
+                <w:sz w:val="40"/>
+                <w:szCs w:val="40"/>
+                <w:lang w:bidi="ml-IN"/>
+              </w:rPr>
+              <w:t xml:space="preserve"> </w:t>
+            </w:r>
+            <w:proofErr w:type="spellStart"/>
+            <w:r>
+              <w:rPr>
+                <w:rFonts w:ascii="BRH Devanagari Extra" w:hAnsi="BRH Devanagari Extra" w:cs="BRH Devanagari Extra"/>
+                <w:color w:val="000000"/>
+                <w:sz w:val="40"/>
+                <w:szCs w:val="40"/>
+                <w:lang w:bidi="ml-IN"/>
+              </w:rPr>
+              <w:t>pÉëÉiÉ×þurÉ</w:t>
+            </w:r>
+            <w:proofErr w:type="spellEnd"/>
+            <w:r>
+              <w:rPr>
+                <w:rFonts w:ascii="BRH Devanagari Extra" w:hAnsi="BRH Devanagari Extra" w:cs="BRH Devanagari Extra"/>
+                <w:color w:val="000000"/>
+                <w:sz w:val="40"/>
+                <w:szCs w:val="40"/>
+                <w:lang w:bidi="ml-IN"/>
+              </w:rPr>
+              <w:t xml:space="preserve"> - A</w:t>
+            </w:r>
+            <w:r>
+              <w:rPr>
+                <w:rFonts w:ascii="BRH Malayalam Extra" w:hAnsi="BRH Malayalam Extra" w:cs="BRH Devanagari Extra"/>
+                <w:b/>
+                <w:color w:val="000000"/>
+                <w:sz w:val="32"/>
+                <w:szCs w:val="40"/>
+                <w:lang w:bidi="ml-IN"/>
+              </w:rPr>
+              <w:t>–</w:t>
+            </w:r>
+            <w:r>
+              <w:rPr>
+                <w:rFonts w:ascii="BRH Devanagari Extra" w:hAnsi="BRH Devanagari Extra" w:cs="BRH Devanagari Extra"/>
+                <w:color w:val="000000"/>
+                <w:sz w:val="40"/>
+                <w:szCs w:val="40"/>
+                <w:lang w:bidi="ml-IN"/>
+              </w:rPr>
+              <w:t>mÉ</w:t>
+            </w:r>
+            <w:r>
+              <w:rPr>
+                <w:rFonts w:ascii="BRH Malayalam Extra" w:hAnsi="BRH Malayalam Extra" w:cs="BRH Devanagari Extra"/>
+                <w:b/>
+                <w:color w:val="000000"/>
+                <w:sz w:val="32"/>
+                <w:szCs w:val="40"/>
+                <w:lang w:bidi="ml-IN"/>
+              </w:rPr>
+              <w:t>–</w:t>
+            </w:r>
+            <w:proofErr w:type="spellStart"/>
+            <w:r>
+              <w:rPr>
+                <w:rFonts w:ascii="BRH Devanagari Extra" w:hAnsi="BRH Devanagari Extra" w:cs="BRH Devanagari Extra"/>
+                <w:color w:val="000000"/>
+                <w:sz w:val="40"/>
+                <w:szCs w:val="40"/>
+                <w:lang w:bidi="ml-IN"/>
+              </w:rPr>
+              <w:t>lÉÑ</w:t>
+            </w:r>
+            <w:proofErr w:type="spellEnd"/>
+            <w:r>
+              <w:rPr>
+                <w:rFonts w:ascii="BRH Malayalam Extra" w:hAnsi="BRH Malayalam Extra" w:cs="BRH Devanagari Extra"/>
+                <w:b/>
+                <w:color w:val="000000"/>
+                <w:sz w:val="32"/>
+                <w:szCs w:val="40"/>
+                <w:lang w:bidi="ml-IN"/>
+              </w:rPr>
+              <w:t>–</w:t>
+            </w:r>
+            <w:proofErr w:type="spellStart"/>
+            <w:r>
+              <w:rPr>
+                <w:rFonts w:ascii="BRH Devanagari Extra" w:hAnsi="BRH Devanagari Extra" w:cs="BRH Devanagari Extra"/>
+                <w:color w:val="EE0000"/>
+                <w:sz w:val="40"/>
+                <w:szCs w:val="40"/>
+                <w:highlight w:val="yellow"/>
+                <w:lang w:bidi="ml-IN"/>
+              </w:rPr>
+              <w:t>irÉæ</w:t>
+            </w:r>
+            <w:proofErr w:type="spellEnd"/>
+            <w:r>
+              <w:rPr>
+                <w:rFonts w:ascii="BRH Malayalam Extra" w:hAnsi="BRH Malayalam Extra" w:cs="BRH Devanagari Extra"/>
+                <w:b/>
+                <w:color w:val="EE0000"/>
+                <w:sz w:val="32"/>
+                <w:szCs w:val="40"/>
+                <w:highlight w:val="yellow"/>
+                <w:lang w:bidi="ml-IN"/>
+              </w:rPr>
+              <w:t>–</w:t>
+            </w:r>
+            <w:r>
+              <w:rPr>
+                <w:rFonts w:ascii="BRH Devanagari Extra" w:hAnsi="BRH Devanagari Extra" w:cs="BRH Devanagari Extra"/>
+                <w:color w:val="000000"/>
+                <w:sz w:val="40"/>
+                <w:szCs w:val="40"/>
+                <w:lang w:bidi="ml-IN"/>
+              </w:rPr>
+              <w:t xml:space="preserve"> |</w:t>
+            </w:r>
+          </w:p>
+        </w:tc>
+      </w:tr>
+    </w:tbl>
+    <w:p>
+      <w:pPr>
+        <w:jc w:val="center"/>
+        <w:rPr>
+          <w:b/>
+          <w:bCs/>
+          <w:sz w:val="32"/>
+          <w:szCs w:val="32"/>
+          <w:u w:val="single"/>
+        </w:rPr>
+      </w:pPr>
+      <w:r>
+        <w:rPr>
+          <w:b/>
+          <w:bCs/>
+          <w:sz w:val="32"/>
+          <w:szCs w:val="32"/>
+          <w:u w:val="single"/>
+        </w:rPr>
+        <w:t>==========</w:t>
+      </w:r>
+    </w:p>
+    <w:p>
+      <w:pPr>
+        <w:jc w:val="center"/>
+        <w:rPr>
+          <w:b/>
+          <w:bCs/>
+          <w:sz w:val="32"/>
+          <w:szCs w:val="32"/>
+          <w:u w:val="single"/>
+        </w:rPr>
+      </w:pPr>
+    </w:p>
+    <w:p>
+      <w:pPr>
+        <w:jc w:val="center"/>
+        <w:rPr>
+          <w:b/>
+          <w:bCs/>
+          <w:sz w:val="32"/>
+          <w:szCs w:val="32"/>
+          <w:u w:val="single"/>
+        </w:rPr>
+      </w:pPr>
+    </w:p>
+    <w:p>
+      <w:pPr>
+        <w:jc w:val="center"/>
+        <w:rPr>
+          <w:b/>
+          <w:bCs/>
+          <w:sz w:val="32"/>
+          <w:szCs w:val="32"/>
+          <w:u w:val="single"/>
+        </w:rPr>
+      </w:pPr>
+      <w:r>
+        <w:rPr>
+          <w:b/>
+          <w:bCs/>
+          <w:sz w:val="32"/>
+          <w:szCs w:val="32"/>
+          <w:u w:val="single"/>
+        </w:rPr>
+        <w:lastRenderedPageBreak/>
         <w:t xml:space="preserve">TS </w:t>
       </w:r>
       <w:r>
@@ -406,21 +2361,8 @@
                 <w:highlight w:val="yellow"/>
                 <w:lang w:bidi="ml-IN"/>
               </w:rPr>
-              <w:t xml:space="preserve"> </w:t>
-            </w:r>
-            <w:proofErr w:type="spellStart"/>
-            <w:r>
-              <w:rPr>
-                <w:rFonts w:ascii="BRH Devanagari Extra" w:hAnsi="BRH Devanagari Extra" w:cs="BRH Devanagari Extra"/>
-                <w:color w:val="000000"/>
-                <w:sz w:val="40"/>
-                <w:szCs w:val="40"/>
-                <w:highlight w:val="yellow"/>
-                <w:lang w:bidi="ml-IN"/>
-              </w:rPr>
-              <w:t>lÉç</w:t>
-            </w:r>
-            <w:proofErr w:type="spellEnd"/>
+              <w:t xml:space="preserve"> lÉç</w:t>
+            </w:r>
             <w:r>
               <w:rPr>
                 <w:rFonts w:ascii="BRH Devanagari Extra" w:hAnsi="BRH Devanagari Extra" w:cs="BRH Devanagari Extra"/>
@@ -496,21 +2438,8 @@
                 <w:highlight w:val="green"/>
                 <w:lang w:bidi="ml-IN"/>
               </w:rPr>
-              <w:t xml:space="preserve"> </w:t>
-            </w:r>
-            <w:proofErr w:type="spellStart"/>
-            <w:r>
-              <w:rPr>
-                <w:rFonts w:ascii="BRH Devanagari Extra" w:hAnsi="BRH Devanagari Extra" w:cs="BRH Devanagari Extra"/>
-                <w:color w:val="000000"/>
-                <w:sz w:val="40"/>
-                <w:szCs w:val="40"/>
-                <w:highlight w:val="green"/>
-                <w:lang w:bidi="ml-IN"/>
-              </w:rPr>
-              <w:t>lÉ</w:t>
-            </w:r>
-            <w:proofErr w:type="spellEnd"/>
+              <w:t xml:space="preserve"> lÉ</w:t>
+            </w:r>
             <w:r>
               <w:rPr>
                 <w:rFonts w:ascii="BRH Devanagari Extra" w:hAnsi="BRH Devanagari Extra" w:cs="BRH Devanagari Extra"/>
@@ -712,7 +2641,6 @@
                 <w:lang w:bidi="ml-IN"/>
               </w:rPr>
             </w:pPr>
-            <w:proofErr w:type="spellStart"/>
             <w:r>
               <w:rPr>
                 <w:rFonts w:ascii="BRH Devanagari Extra" w:hAnsi="BRH Devanagari Extra" w:cs="BRH Devanagari Extra"/>
@@ -723,7 +2651,6 @@
               </w:rPr>
               <w:t>Nû</w:t>
             </w:r>
-            <w:proofErr w:type="spellEnd"/>
             <w:r>
               <w:rPr>
                 <w:rFonts w:ascii="BRH Malayalam Extra" w:hAnsi="BRH Malayalam Extra" w:cs="BRH Devanagari Extra"/>
@@ -850,20 +2777,8 @@
                 <w:szCs w:val="40"/>
                 <w:lang w:bidi="ml-IN"/>
               </w:rPr>
-              <w:t xml:space="preserve"> - </w:t>
-            </w:r>
-            <w:proofErr w:type="spellStart"/>
-            <w:r>
-              <w:rPr>
-                <w:rFonts w:ascii="BRH Devanagari Extra" w:hAnsi="BRH Devanagari Extra" w:cs="BRH Devanagari Extra"/>
-                <w:color w:val="000000"/>
-                <w:sz w:val="40"/>
-                <w:szCs w:val="40"/>
-                <w:lang w:bidi="ml-IN"/>
-              </w:rPr>
-              <w:t>MÑü</w:t>
-            </w:r>
-            <w:proofErr w:type="spellEnd"/>
+              <w:t xml:space="preserve"> - MÑü</w:t>
+            </w:r>
             <w:r>
               <w:rPr>
                 <w:rFonts w:ascii="BRH Malayalam Extra" w:hAnsi="BRH Malayalam Extra" w:cs="BRH Devanagari Extra"/>
@@ -918,7 +2833,6 @@
                 <w:lang w:bidi="ml-IN"/>
               </w:rPr>
             </w:pPr>
-            <w:proofErr w:type="spellStart"/>
             <w:r>
               <w:rPr>
                 <w:rFonts w:ascii="BRH Devanagari Extra" w:hAnsi="BRH Devanagari Extra" w:cs="BRH Devanagari Extra"/>
@@ -929,7 +2843,6 @@
               </w:rPr>
               <w:t>Nû</w:t>
             </w:r>
-            <w:proofErr w:type="spellEnd"/>
             <w:r>
               <w:rPr>
                 <w:rFonts w:ascii="BRH Malayalam Extra" w:hAnsi="BRH Malayalam Extra" w:cs="BRH Devanagari Extra"/>
@@ -1057,20 +2970,8 @@
                 <w:szCs w:val="40"/>
                 <w:lang w:bidi="ml-IN"/>
               </w:rPr>
-              <w:t xml:space="preserve"> - </w:t>
-            </w:r>
-            <w:proofErr w:type="spellStart"/>
-            <w:r>
-              <w:rPr>
-                <w:rFonts w:ascii="BRH Devanagari Extra" w:hAnsi="BRH Devanagari Extra" w:cs="BRH Devanagari Extra"/>
-                <w:color w:val="000000"/>
-                <w:sz w:val="40"/>
-                <w:szCs w:val="40"/>
-                <w:lang w:bidi="ml-IN"/>
-              </w:rPr>
-              <w:t>MÑü</w:t>
-            </w:r>
-            <w:proofErr w:type="spellEnd"/>
+              <w:t xml:space="preserve"> - MÑü</w:t>
+            </w:r>
             <w:r>
               <w:rPr>
                 <w:rFonts w:ascii="BRH Malayalam Extra" w:hAnsi="BRH Malayalam Extra" w:cs="BRH Devanagari Extra"/>
@@ -1151,7 +3052,6 @@
         </w:rPr>
         <w:t xml:space="preserve">TS </w:t>
       </w:r>
-      <w:proofErr w:type="spellStart"/>
       <w:r>
         <w:rPr>
           <w:b/>
@@ -1162,7 +3062,6 @@
         </w:rPr>
         <w:t>Krama</w:t>
       </w:r>
-      <w:proofErr w:type="spellEnd"/>
       <w:r>
         <w:rPr>
           <w:b/>
@@ -1171,29 +3070,7 @@
           <w:szCs w:val="32"/>
           <w:u w:val="single"/>
         </w:rPr>
-        <w:t xml:space="preserve"> </w:t>
-      </w:r>
-      <w:proofErr w:type="spellStart"/>
-      <w:r>
-        <w:rPr>
-          <w:b/>
-          <w:bCs/>
-          <w:sz w:val="32"/>
-          <w:szCs w:val="32"/>
-          <w:u w:val="single"/>
-        </w:rPr>
-        <w:t>Paatam</w:t>
-      </w:r>
-      <w:proofErr w:type="spellEnd"/>
-      <w:r>
-        <w:rPr>
-          <w:b/>
-          <w:bCs/>
-          <w:sz w:val="32"/>
-          <w:szCs w:val="32"/>
-          <w:u w:val="single"/>
-        </w:rPr>
-        <w:t xml:space="preserve"> – TS </w:t>
+        <w:t xml:space="preserve"> Paatam – TS </w:t>
       </w:r>
       <w:r>
         <w:rPr>
@@ -1321,12 +3198,16 @@
               <w:spacing w:before="0" w:line="240" w:lineRule="auto"/>
               <w:jc w:val="center"/>
               <w:rPr>
+                <w:b/>
+                <w:bCs/>
                 <w:sz w:val="32"/>
                 <w:szCs w:val="32"/>
               </w:rPr>
             </w:pPr>
             <w:r>
               <w:rPr>
+                <w:b/>
+                <w:bCs/>
                 <w:sz w:val="32"/>
                 <w:szCs w:val="32"/>
               </w:rPr>
@@ -1338,12 +3219,16 @@
               <w:spacing w:before="0" w:line="240" w:lineRule="auto"/>
               <w:jc w:val="center"/>
               <w:rPr>
+                <w:b/>
+                <w:bCs/>
                 <w:sz w:val="32"/>
                 <w:szCs w:val="32"/>
               </w:rPr>
             </w:pPr>
             <w:r>
               <w:rPr>
+                <w:b/>
+                <w:bCs/>
                 <w:sz w:val="32"/>
                 <w:szCs w:val="32"/>
               </w:rPr>
@@ -1360,12 +3245,16 @@
               <w:spacing w:before="0" w:line="240" w:lineRule="auto"/>
               <w:jc w:val="center"/>
               <w:rPr>
+                <w:b/>
+                <w:bCs/>
                 <w:sz w:val="32"/>
                 <w:szCs w:val="32"/>
               </w:rPr>
             </w:pPr>
             <w:r>
               <w:rPr>
+                <w:b/>
+                <w:bCs/>
                 <w:sz w:val="32"/>
                 <w:szCs w:val="32"/>
               </w:rPr>
@@ -1383,12 +3272,16 @@
               <w:ind w:right="-18"/>
               <w:jc w:val="center"/>
               <w:rPr>
+                <w:b/>
+                <w:bCs/>
                 <w:sz w:val="32"/>
                 <w:szCs w:val="32"/>
               </w:rPr>
             </w:pPr>
             <w:r>
               <w:rPr>
+                <w:b/>
+                <w:bCs/>
                 <w:sz w:val="32"/>
                 <w:szCs w:val="32"/>
               </w:rPr>
@@ -1549,7 +3442,6 @@
               </w:rPr>
               <w:t>–</w:t>
             </w:r>
-            <w:proofErr w:type="spellStart"/>
             <w:r>
               <w:rPr>
                 <w:rFonts w:ascii="BRH Devanagari Extra" w:hAnsi="BRH Devanagari Extra" w:cs="BRH Devanagari Extra"/>
@@ -1560,7 +3452,6 @@
               </w:rPr>
               <w:t>uÉ</w:t>
             </w:r>
-            <w:proofErr w:type="spellEnd"/>
             <w:r>
               <w:rPr>
                 <w:rFonts w:ascii="BRH Malayalam Extra" w:hAnsi="BRH Malayalam Extra" w:cs="BRH Devanagari Extra"/>
@@ -1643,7 +3534,6 @@
               </w:rPr>
               <w:t>–</w:t>
             </w:r>
-            <w:proofErr w:type="spellStart"/>
             <w:r>
               <w:rPr>
                 <w:rFonts w:ascii="BRH Devanagari Extra" w:hAnsi="BRH Devanagari Extra" w:cs="BRH Devanagari Extra"/>
@@ -1654,7 +3544,6 @@
               </w:rPr>
               <w:t>uÉ</w:t>
             </w:r>
-            <w:proofErr w:type="spellEnd"/>
             <w:r>
               <w:rPr>
                 <w:rFonts w:ascii="BRH Malayalam Extra" w:hAnsi="BRH Malayalam Extra" w:cs="BRH Devanagari Extra"/>
@@ -1785,7 +3674,6 @@
               </w:rPr>
               <w:t>–</w:t>
             </w:r>
-            <w:proofErr w:type="spellStart"/>
             <w:r>
               <w:rPr>
                 <w:rFonts w:ascii="BRH Devanagari Extra" w:hAnsi="BRH Devanagari Extra" w:cs="BRH Devanagari Extra"/>
@@ -1796,7 +3684,6 @@
               </w:rPr>
               <w:t>uÉ</w:t>
             </w:r>
-            <w:proofErr w:type="spellEnd"/>
             <w:r>
               <w:rPr>
                 <w:rFonts w:ascii="BRH Malayalam Extra" w:hAnsi="BRH Malayalam Extra" w:cs="BRH Devanagari Extra"/>
@@ -1879,7 +3766,6 @@
               </w:rPr>
               <w:t>–</w:t>
             </w:r>
-            <w:proofErr w:type="spellStart"/>
             <w:r>
               <w:rPr>
                 <w:rFonts w:ascii="BRH Devanagari Extra" w:hAnsi="BRH Devanagari Extra" w:cs="BRH Devanagari Extra"/>
@@ -1890,7 +3776,6 @@
               </w:rPr>
               <w:t>uÉ</w:t>
             </w:r>
-            <w:proofErr w:type="spellEnd"/>
             <w:r>
               <w:rPr>
                 <w:rFonts w:ascii="BRH Malayalam Extra" w:hAnsi="BRH Malayalam Extra" w:cs="BRH Devanagari Extra"/>
@@ -2241,27 +4126,15 @@
               </w:rPr>
               <w:t>–</w:t>
             </w:r>
-            <w:proofErr w:type="spellStart"/>
-            <w:r>
-              <w:rPr>
-                <w:rFonts w:ascii="BRH Devanagari Extra" w:hAnsi="BRH Devanagari Extra" w:cs="BRH Devanagari Extra"/>
-                <w:color w:val="000000"/>
-                <w:sz w:val="40"/>
-                <w:szCs w:val="40"/>
-                <w:lang w:bidi="ml-IN"/>
-              </w:rPr>
-              <w:t>Uç</w:t>
-            </w:r>
-            <w:proofErr w:type="spellEnd"/>
-            <w:r>
-              <w:rPr>
-                <w:rFonts w:ascii="BRH Devanagari Extra" w:hAnsi="BRH Devanagari Extra" w:cs="BRH Devanagari Extra"/>
-                <w:color w:val="000000"/>
-                <w:sz w:val="40"/>
-                <w:szCs w:val="40"/>
-                <w:lang w:bidi="ml-IN"/>
-              </w:rPr>
-              <w:t xml:space="preserve"> </w:t>
+            <w:r>
+              <w:rPr>
+                <w:rFonts w:ascii="BRH Devanagari Extra" w:hAnsi="BRH Devanagari Extra" w:cs="BRH Devanagari Extra"/>
+                <w:color w:val="000000"/>
+                <w:sz w:val="40"/>
+                <w:szCs w:val="40"/>
+                <w:lang w:bidi="ml-IN"/>
+              </w:rPr>
+              <w:t xml:space="preserve">Uç </w:t>
             </w:r>
             <w:proofErr w:type="spellStart"/>
             <w:r>
@@ -2437,27 +4310,15 @@
               </w:rPr>
               <w:t>–</w:t>
             </w:r>
-            <w:proofErr w:type="spellStart"/>
-            <w:r>
-              <w:rPr>
-                <w:rFonts w:ascii="BRH Devanagari Extra" w:hAnsi="BRH Devanagari Extra" w:cs="BRH Devanagari Extra"/>
-                <w:color w:val="000000"/>
-                <w:sz w:val="40"/>
-                <w:szCs w:val="40"/>
-                <w:lang w:bidi="ml-IN"/>
-              </w:rPr>
-              <w:t>Uç</w:t>
-            </w:r>
-            <w:proofErr w:type="spellEnd"/>
-            <w:r>
-              <w:rPr>
-                <w:rFonts w:ascii="BRH Devanagari Extra" w:hAnsi="BRH Devanagari Extra" w:cs="BRH Devanagari Extra"/>
-                <w:color w:val="000000"/>
-                <w:sz w:val="40"/>
-                <w:szCs w:val="40"/>
-                <w:lang w:bidi="ml-IN"/>
-              </w:rPr>
-              <w:t xml:space="preserve"> </w:t>
+            <w:r>
+              <w:rPr>
+                <w:rFonts w:ascii="BRH Devanagari Extra" w:hAnsi="BRH Devanagari Extra" w:cs="BRH Devanagari Extra"/>
+                <w:color w:val="000000"/>
+                <w:sz w:val="40"/>
+                <w:szCs w:val="40"/>
+                <w:lang w:bidi="ml-IN"/>
+              </w:rPr>
+              <w:t xml:space="preserve">Uç </w:t>
             </w:r>
             <w:proofErr w:type="spellStart"/>
             <w:r>
@@ -2706,27 +4567,15 @@
               </w:rPr>
               <w:t>–</w:t>
             </w:r>
-            <w:proofErr w:type="spellStart"/>
-            <w:r>
-              <w:rPr>
-                <w:rFonts w:ascii="BRH Devanagari Extra" w:hAnsi="BRH Devanagari Extra" w:cs="BRH Devanagari Extra"/>
-                <w:color w:val="000000"/>
-                <w:sz w:val="40"/>
-                <w:szCs w:val="40"/>
-                <w:lang w:bidi="ml-IN"/>
-              </w:rPr>
-              <w:t>uÉ</w:t>
-            </w:r>
-            <w:proofErr w:type="spellEnd"/>
-            <w:r>
-              <w:rPr>
-                <w:rFonts w:ascii="BRH Devanagari Extra" w:hAnsi="BRH Devanagari Extra" w:cs="BRH Devanagari Extra"/>
-                <w:color w:val="000000"/>
-                <w:sz w:val="40"/>
-                <w:szCs w:val="40"/>
-                <w:lang w:bidi="ml-IN"/>
-              </w:rPr>
-              <w:t xml:space="preserve"> |</w:t>
+            <w:r>
+              <w:rPr>
+                <w:rFonts w:ascii="BRH Devanagari Extra" w:hAnsi="BRH Devanagari Extra" w:cs="BRH Devanagari Extra"/>
+                <w:color w:val="000000"/>
+                <w:sz w:val="40"/>
+                <w:szCs w:val="40"/>
+                <w:lang w:bidi="ml-IN"/>
+              </w:rPr>
+              <w:t>uÉ |</w:t>
             </w:r>
           </w:p>
         </w:tc>
@@ -2845,27 +4694,15 @@
               </w:rPr>
               <w:t>–</w:t>
             </w:r>
-            <w:proofErr w:type="spellStart"/>
-            <w:r>
-              <w:rPr>
-                <w:rFonts w:ascii="BRH Devanagari Extra" w:hAnsi="BRH Devanagari Extra" w:cs="BRH Devanagari Extra"/>
-                <w:color w:val="000000"/>
-                <w:sz w:val="40"/>
-                <w:szCs w:val="40"/>
-                <w:lang w:bidi="ml-IN"/>
-              </w:rPr>
-              <w:t>uÉ</w:t>
-            </w:r>
-            <w:proofErr w:type="spellEnd"/>
-            <w:r>
-              <w:rPr>
-                <w:rFonts w:ascii="BRH Devanagari Extra" w:hAnsi="BRH Devanagari Extra" w:cs="BRH Devanagari Extra"/>
-                <w:color w:val="000000"/>
-                <w:sz w:val="40"/>
-                <w:szCs w:val="40"/>
-                <w:lang w:bidi="ml-IN"/>
-              </w:rPr>
-              <w:t xml:space="preserve"> |</w:t>
+            <w:r>
+              <w:rPr>
+                <w:rFonts w:ascii="BRH Devanagari Extra" w:hAnsi="BRH Devanagari Extra" w:cs="BRH Devanagari Extra"/>
+                <w:color w:val="000000"/>
+                <w:sz w:val="40"/>
+                <w:szCs w:val="40"/>
+                <w:lang w:bidi="ml-IN"/>
+              </w:rPr>
+              <w:t>uÉ |</w:t>
             </w:r>
           </w:p>
         </w:tc>
@@ -3041,7 +4878,6 @@
               </w:rPr>
               <w:t>–</w:t>
             </w:r>
-            <w:proofErr w:type="spellStart"/>
             <w:r>
               <w:rPr>
                 <w:rFonts w:ascii="BRH Devanagari Extra" w:hAnsi="BRH Devanagari Extra" w:cs="BRH Devanagari Extra"/>
@@ -3052,7 +4888,6 @@
               </w:rPr>
               <w:t>Mü</w:t>
             </w:r>
-            <w:proofErr w:type="spellEnd"/>
             <w:r>
               <w:rPr>
                 <w:rFonts w:ascii="BRH Malayalam Extra" w:hAnsi="BRH Malayalam Extra" w:cs="BRH Devanagari Extra"/>
@@ -3174,7 +5009,6 @@
               </w:rPr>
               <w:t>–</w:t>
             </w:r>
-            <w:proofErr w:type="spellStart"/>
             <w:r>
               <w:rPr>
                 <w:rFonts w:ascii="BRH Devanagari Extra" w:hAnsi="BRH Devanagari Extra" w:cs="BRH Devanagari Extra"/>
@@ -3185,7 +5019,6 @@
               </w:rPr>
               <w:t>Mü</w:t>
             </w:r>
-            <w:proofErr w:type="spellEnd"/>
             <w:r>
               <w:rPr>
                 <w:rFonts w:ascii="BRH Malayalam Extra" w:hAnsi="BRH Malayalam Extra" w:cs="BRH Devanagari Extra"/>
@@ -3251,20 +5084,8 @@
                 <w:szCs w:val="40"/>
                 <w:lang w:bidi="ml-IN"/>
               </w:rPr>
-              <w:t xml:space="preserve"> - </w:t>
-            </w:r>
-            <w:proofErr w:type="spellStart"/>
-            <w:r>
-              <w:rPr>
-                <w:rFonts w:ascii="BRH Devanagari Extra" w:hAnsi="BRH Devanagari Extra" w:cs="BRH Devanagari Extra"/>
-                <w:color w:val="000000"/>
-                <w:sz w:val="40"/>
-                <w:szCs w:val="40"/>
-                <w:lang w:bidi="ml-IN"/>
-              </w:rPr>
-              <w:t>Mü</w:t>
-            </w:r>
-            <w:proofErr w:type="spellEnd"/>
+              <w:t xml:space="preserve"> - Mü</w:t>
+            </w:r>
             <w:r>
               <w:rPr>
                 <w:rFonts w:ascii="BRH Malayalam Extra" w:hAnsi="BRH Malayalam Extra" w:cs="BRH Devanagari Extra"/>
@@ -3364,7 +5185,6 @@
               </w:rPr>
               <w:t>–</w:t>
             </w:r>
-            <w:proofErr w:type="spellStart"/>
             <w:r>
               <w:rPr>
                 <w:rFonts w:ascii="BRH Devanagari Extra" w:hAnsi="BRH Devanagari Extra" w:cs="BRH Devanagari Extra"/>
@@ -3375,7 +5195,6 @@
               </w:rPr>
               <w:t>Mü</w:t>
             </w:r>
-            <w:proofErr w:type="spellEnd"/>
             <w:r>
               <w:rPr>
                 <w:rFonts w:ascii="BRH Malayalam Extra" w:hAnsi="BRH Malayalam Extra" w:cs="BRH Devanagari Extra"/>
@@ -3497,7 +5316,6 @@
               </w:rPr>
               <w:t>–</w:t>
             </w:r>
-            <w:proofErr w:type="spellStart"/>
             <w:r>
               <w:rPr>
                 <w:rFonts w:ascii="BRH Devanagari Extra" w:hAnsi="BRH Devanagari Extra" w:cs="BRH Devanagari Extra"/>
@@ -3508,7 +5326,6 @@
               </w:rPr>
               <w:t>Mü</w:t>
             </w:r>
-            <w:proofErr w:type="spellEnd"/>
             <w:r>
               <w:rPr>
                 <w:rFonts w:ascii="BRH Malayalam Extra" w:hAnsi="BRH Malayalam Extra" w:cs="BRH Devanagari Extra"/>
@@ -3551,20 +5368,8 @@
                 <w:szCs w:val="40"/>
                 <w:lang w:bidi="ml-IN"/>
               </w:rPr>
-              <w:t xml:space="preserve"> - </w:t>
-            </w:r>
-            <w:proofErr w:type="spellStart"/>
-            <w:r>
-              <w:rPr>
-                <w:rFonts w:ascii="BRH Devanagari Extra" w:hAnsi="BRH Devanagari Extra" w:cs="BRH Devanagari Extra"/>
-                <w:color w:val="000000"/>
-                <w:sz w:val="40"/>
-                <w:szCs w:val="40"/>
-                <w:lang w:bidi="ml-IN"/>
-              </w:rPr>
-              <w:t>Mü</w:t>
-            </w:r>
-            <w:proofErr w:type="spellEnd"/>
+              <w:t xml:space="preserve"> - Mü</w:t>
+            </w:r>
             <w:r>
               <w:rPr>
                 <w:rFonts w:ascii="BRH Malayalam Extra" w:hAnsi="BRH Malayalam Extra" w:cs="BRH Devanagari Extra"/>
@@ -4052,23 +5857,7 @@
                 <w:b/>
                 <w:bCs/>
               </w:rPr>
-              <w:t>it is “</w:t>
-            </w:r>
-            <w:proofErr w:type="spellStart"/>
-            <w:r>
-              <w:rPr>
-                <w:b/>
-                <w:bCs/>
-              </w:rPr>
-              <w:t>ti</w:t>
-            </w:r>
-            <w:proofErr w:type="spellEnd"/>
-            <w:r>
-              <w:rPr>
-                <w:b/>
-                <w:bCs/>
-              </w:rPr>
-              <w:t>”)</w:t>
+              <w:t>it is “ti”)</w:t>
             </w:r>
           </w:p>
         </w:tc>
@@ -4198,7 +5987,6 @@
                 <w:lang w:val="en-IN" w:eastAsia="en-IN" w:bidi="ml-IN"/>
               </w:rPr>
             </w:pPr>
-            <w:proofErr w:type="spellStart"/>
             <w:r>
               <w:rPr>
                 <w:rFonts w:ascii="BRH Devanagari Extra" w:hAnsi="BRH Devanagari Extra" w:cs="BRH Devanagari Extra"/>
@@ -4209,7 +5997,6 @@
               </w:rPr>
               <w:t>oÉ</w:t>
             </w:r>
-            <w:proofErr w:type="spellEnd"/>
             <w:r>
               <w:rPr>
                 <w:rFonts w:ascii="BRH Malayalam Extra" w:hAnsi="BRH Malayalam Extra" w:cs="BRH Devanagari Extra"/>
@@ -4372,7 +6159,6 @@
                 <w:lang w:val="en-IN" w:eastAsia="en-IN" w:bidi="ml-IN"/>
               </w:rPr>
             </w:pPr>
-            <w:proofErr w:type="spellStart"/>
             <w:r>
               <w:rPr>
                 <w:rFonts w:ascii="BRH Devanagari Extra" w:hAnsi="BRH Devanagari Extra" w:cs="BRH Devanagari Extra"/>
@@ -4383,7 +6169,6 @@
               </w:rPr>
               <w:t>oÉ</w:t>
             </w:r>
-            <w:proofErr w:type="spellEnd"/>
             <w:r>
               <w:rPr>
                 <w:rFonts w:ascii="BRH Malayalam Extra" w:hAnsi="BRH Malayalam Extra" w:cs="BRH Devanagari Extra"/>
@@ -4705,7 +6490,6 @@
               </w:rPr>
               <w:t>–</w:t>
             </w:r>
-            <w:proofErr w:type="spellStart"/>
             <w:r>
               <w:rPr>
                 <w:rFonts w:ascii="BRH Devanagari Extra" w:hAnsi="BRH Devanagari Extra" w:cs="BRH Devanagari Extra"/>
@@ -4716,7 +6500,6 @@
               </w:rPr>
               <w:t>uÉ</w:t>
             </w:r>
-            <w:proofErr w:type="spellEnd"/>
             <w:r>
               <w:rPr>
                 <w:rFonts w:ascii="BRH Malayalam Extra" w:hAnsi="BRH Malayalam Extra" w:cs="BRH Devanagari Extra"/>
@@ -4829,7 +6612,6 @@
               </w:rPr>
               <w:t>–</w:t>
             </w:r>
-            <w:proofErr w:type="spellStart"/>
             <w:r>
               <w:rPr>
                 <w:rFonts w:ascii="BRH Devanagari Extra" w:hAnsi="BRH Devanagari Extra" w:cs="BRH Devanagari Extra"/>
@@ -4840,7 +6622,6 @@
               </w:rPr>
               <w:t>uÉ</w:t>
             </w:r>
-            <w:proofErr w:type="spellEnd"/>
             <w:r>
               <w:rPr>
                 <w:rFonts w:ascii="BRH Malayalam Extra" w:hAnsi="BRH Malayalam Extra" w:cs="BRH Devanagari Extra"/>
@@ -4894,20 +6675,8 @@
                 <w:szCs w:val="40"/>
                 <w:lang w:bidi="ml-IN"/>
               </w:rPr>
-              <w:t xml:space="preserve"> - </w:t>
-            </w:r>
-            <w:proofErr w:type="spellStart"/>
-            <w:r>
-              <w:rPr>
-                <w:rFonts w:ascii="BRH Devanagari Extra" w:hAnsi="BRH Devanagari Extra" w:cs="BRH Devanagari Extra"/>
-                <w:color w:val="000000"/>
-                <w:sz w:val="40"/>
-                <w:szCs w:val="40"/>
-                <w:lang w:bidi="ml-IN"/>
-              </w:rPr>
-              <w:t>uÉ</w:t>
-            </w:r>
-            <w:proofErr w:type="spellEnd"/>
+              <w:t xml:space="preserve"> - uÉ</w:t>
+            </w:r>
             <w:r>
               <w:rPr>
                 <w:rFonts w:ascii="BRH Malayalam Extra" w:hAnsi="BRH Malayalam Extra" w:cs="BRH Devanagari Extra"/>
@@ -5002,7 +6771,6 @@
               </w:rPr>
               <w:t>–</w:t>
             </w:r>
-            <w:proofErr w:type="spellStart"/>
             <w:r>
               <w:rPr>
                 <w:rFonts w:ascii="BRH Devanagari Extra" w:hAnsi="BRH Devanagari Extra" w:cs="BRH Devanagari Extra"/>
@@ -5013,7 +6781,6 @@
               </w:rPr>
               <w:t>uÉ</w:t>
             </w:r>
-            <w:proofErr w:type="spellEnd"/>
             <w:r>
               <w:rPr>
                 <w:rFonts w:ascii="BRH Malayalam Extra" w:hAnsi="BRH Malayalam Extra" w:cs="BRH Devanagari Extra"/>
@@ -5215,20 +6982,8 @@
                 <w:szCs w:val="40"/>
                 <w:lang w:bidi="ml-IN"/>
               </w:rPr>
-              <w:t xml:space="preserve"> - </w:t>
-            </w:r>
-            <w:proofErr w:type="spellStart"/>
-            <w:r>
-              <w:rPr>
-                <w:rFonts w:ascii="BRH Devanagari Extra" w:hAnsi="BRH Devanagari Extra" w:cs="BRH Devanagari Extra"/>
-                <w:color w:val="000000"/>
-                <w:sz w:val="40"/>
-                <w:szCs w:val="40"/>
-                <w:lang w:bidi="ml-IN"/>
-              </w:rPr>
-              <w:t>uÉ</w:t>
-            </w:r>
-            <w:proofErr w:type="spellEnd"/>
+              <w:t xml:space="preserve"> - uÉ</w:t>
+            </w:r>
             <w:r>
               <w:rPr>
                 <w:rFonts w:ascii="BRH Malayalam Extra" w:hAnsi="BRH Malayalam Extra" w:cs="BRH Devanagari Extra"/>
@@ -5436,7 +7191,6 @@
               </w:rPr>
               <w:t>–</w:t>
             </w:r>
-            <w:proofErr w:type="spellStart"/>
             <w:r>
               <w:rPr>
                 <w:rFonts w:ascii="BRH Devanagari Extra" w:hAnsi="BRH Devanagari Extra" w:cs="BRH Devanagari Extra"/>
@@ -5447,7 +7201,6 @@
               </w:rPr>
               <w:t>óè</w:t>
             </w:r>
-            <w:proofErr w:type="spellEnd"/>
             <w:r>
               <w:rPr>
                 <w:rFonts w:ascii="BRH Malayalam Extra" w:hAnsi="BRH Malayalam Extra" w:cs="BRH Devanagari Extra"/>
@@ -5558,7 +7311,6 @@
               </w:rPr>
               <w:t>–</w:t>
             </w:r>
-            <w:proofErr w:type="spellStart"/>
             <w:r>
               <w:rPr>
                 <w:rFonts w:ascii="BRH Devanagari Extra" w:hAnsi="BRH Devanagari Extra" w:cs="BRH Devanagari Extra"/>
@@ -5580,7 +7332,6 @@
               </w:rPr>
               <w:t>è</w:t>
             </w:r>
-            <w:proofErr w:type="spellEnd"/>
             <w:r>
               <w:rPr>
                 <w:rFonts w:ascii="BRH Malayalam Extra" w:hAnsi="BRH Malayalam Extra" w:cs="BRH Devanagari Extra"/>
@@ -5625,7 +7376,6 @@
               </w:rPr>
               <w:t>–</w:t>
             </w:r>
-            <w:proofErr w:type="spellStart"/>
             <w:r>
               <w:rPr>
                 <w:rFonts w:ascii="BRH Devanagari Extra" w:hAnsi="BRH Devanagari Extra" w:cs="BRH Devanagari Extra"/>
@@ -5636,7 +7386,6 @@
               </w:rPr>
               <w:t>óè</w:t>
             </w:r>
-            <w:proofErr w:type="spellEnd"/>
             <w:r>
               <w:rPr>
                 <w:rFonts w:ascii="BRH Malayalam Extra" w:hAnsi="BRH Malayalam Extra" w:cs="BRH Devanagari Extra"/>
@@ -5735,7 +7484,6 @@
               </w:rPr>
               <w:t>–</w:t>
             </w:r>
-            <w:proofErr w:type="spellStart"/>
             <w:r>
               <w:rPr>
                 <w:rFonts w:ascii="BRH Devanagari Extra" w:hAnsi="BRH Devanagari Extra" w:cs="BRH Devanagari Extra"/>
@@ -5746,7 +7494,6 @@
               </w:rPr>
               <w:t>óè</w:t>
             </w:r>
-            <w:proofErr w:type="spellEnd"/>
             <w:r>
               <w:rPr>
                 <w:rFonts w:ascii="BRH Malayalam Extra" w:hAnsi="BRH Malayalam Extra" w:cs="BRH Devanagari Extra"/>
@@ -5910,7 +7657,6 @@
               </w:rPr>
               <w:t>–</w:t>
             </w:r>
-            <w:proofErr w:type="spellStart"/>
             <w:r>
               <w:rPr>
                 <w:rFonts w:ascii="BRH Devanagari Extra" w:hAnsi="BRH Devanagari Extra" w:cs="BRH Devanagari Extra"/>
@@ -5921,7 +7667,6 @@
               </w:rPr>
               <w:t>óè</w:t>
             </w:r>
-            <w:proofErr w:type="spellEnd"/>
             <w:r>
               <w:rPr>
                 <w:rFonts w:ascii="BRH Malayalam Extra" w:hAnsi="BRH Malayalam Extra" w:cs="BRH Devanagari Extra"/>
@@ -6083,7 +7828,6 @@
                 <w:lang w:val="en-IN" w:eastAsia="en-IN" w:bidi="ml-IN"/>
               </w:rPr>
             </w:pPr>
-            <w:proofErr w:type="spellStart"/>
             <w:r>
               <w:rPr>
                 <w:rFonts w:ascii="BRH Devanagari Extra" w:hAnsi="BRH Devanagari Extra" w:cs="BRH Devanagari Extra"/>
@@ -6094,7 +7838,6 @@
               </w:rPr>
               <w:t>xÉ</w:t>
             </w:r>
-            <w:proofErr w:type="spellEnd"/>
             <w:r>
               <w:rPr>
                 <w:rFonts w:ascii="BRH Malayalam Extra" w:hAnsi="BRH Malayalam Extra" w:cs="BRH Devanagari Extra"/>
@@ -6126,20 +7869,8 @@
                 <w:szCs w:val="40"/>
                 <w:lang w:bidi="ml-IN"/>
               </w:rPr>
-              <w:t xml:space="preserve"> | </w:t>
-            </w:r>
-            <w:proofErr w:type="spellStart"/>
-            <w:r>
-              <w:rPr>
-                <w:rFonts w:ascii="BRH Devanagari Extra" w:hAnsi="BRH Devanagari Extra" w:cs="BRH Devanagari Extra"/>
-                <w:color w:val="000000"/>
-                <w:sz w:val="40"/>
-                <w:szCs w:val="40"/>
-                <w:lang w:bidi="ml-IN"/>
-              </w:rPr>
-              <w:t>xÉ</w:t>
-            </w:r>
-            <w:proofErr w:type="spellEnd"/>
+              <w:t xml:space="preserve"> | xÉ</w:t>
+            </w:r>
             <w:r>
               <w:rPr>
                 <w:rFonts w:ascii="BRH Malayalam Extra" w:hAnsi="BRH Malayalam Extra" w:cs="BRH Devanagari Extra"/>
@@ -6250,7 +7981,6 @@
                 <w:lang w:val="en-IN" w:eastAsia="en-IN" w:bidi="ml-IN"/>
               </w:rPr>
             </w:pPr>
-            <w:proofErr w:type="spellStart"/>
             <w:r>
               <w:rPr>
                 <w:rFonts w:ascii="BRH Devanagari Extra" w:hAnsi="BRH Devanagari Extra" w:cs="BRH Devanagari Extra"/>
@@ -6261,7 +7991,6 @@
               </w:rPr>
               <w:t>xÉ</w:t>
             </w:r>
-            <w:proofErr w:type="spellEnd"/>
             <w:r>
               <w:rPr>
                 <w:rFonts w:ascii="BRH Malayalam Extra" w:hAnsi="BRH Malayalam Extra" w:cs="BRH Devanagari Extra"/>
@@ -6293,20 +8022,8 @@
                 <w:szCs w:val="40"/>
                 <w:lang w:bidi="ml-IN"/>
               </w:rPr>
-              <w:t xml:space="preserve"> | </w:t>
-            </w:r>
-            <w:proofErr w:type="spellStart"/>
-            <w:r>
-              <w:rPr>
-                <w:rFonts w:ascii="BRH Devanagari Extra" w:hAnsi="BRH Devanagari Extra" w:cs="BRH Devanagari Extra"/>
-                <w:color w:val="000000"/>
-                <w:sz w:val="40"/>
-                <w:szCs w:val="40"/>
-                <w:lang w:bidi="ml-IN"/>
-              </w:rPr>
-              <w:t>xÉ</w:t>
-            </w:r>
-            <w:proofErr w:type="spellEnd"/>
+              <w:t xml:space="preserve"> | xÉ</w:t>
+            </w:r>
             <w:r>
               <w:rPr>
                 <w:rFonts w:ascii="BRH Malayalam Extra" w:hAnsi="BRH Malayalam Extra" w:cs="BRH Devanagari Extra"/>
@@ -6599,7 +8316,6 @@
               </w:rPr>
               <w:t>–</w:t>
             </w:r>
-            <w:proofErr w:type="spellStart"/>
             <w:r>
               <w:rPr>
                 <w:rFonts w:ascii="BRH Devanagari Extra" w:hAnsi="BRH Devanagari Extra" w:cs="BRH Devanagari Extra"/>
@@ -6610,7 +8326,6 @@
               </w:rPr>
               <w:t>Uç</w:t>
             </w:r>
-            <w:proofErr w:type="spellEnd"/>
             <w:r>
               <w:rPr>
                 <w:rFonts w:ascii="BRH Devanagari Extra" w:hAnsi="BRH Devanagari Extra" w:cs="BRH Devanagari Extra"/>
@@ -6738,7 +8453,6 @@
               </w:rPr>
               <w:t>–</w:t>
             </w:r>
-            <w:proofErr w:type="spellStart"/>
             <w:r>
               <w:rPr>
                 <w:rFonts w:ascii="BRH Devanagari Extra" w:hAnsi="BRH Devanagari Extra" w:cs="BRH Devanagari Extra"/>
@@ -6749,7 +8463,6 @@
               </w:rPr>
               <w:t>Uç</w:t>
             </w:r>
-            <w:proofErr w:type="spellEnd"/>
             <w:r>
               <w:rPr>
                 <w:rFonts w:ascii="BRH Devanagari Extra" w:hAnsi="BRH Devanagari Extra" w:cs="BRH Devanagari Extra"/>
@@ -6924,7 +8637,6 @@
                 <w:lang w:bidi="ml-IN"/>
               </w:rPr>
             </w:pPr>
-            <w:proofErr w:type="spellStart"/>
             <w:r>
               <w:rPr>
                 <w:rFonts w:ascii="BRH Devanagari Extra" w:hAnsi="BRH Devanagari Extra" w:cs="BRH Devanagari Extra"/>
@@ -6935,19 +8647,17 @@
               </w:rPr>
               <w:t>xÉ</w:t>
             </w:r>
-            <w:proofErr w:type="spellEnd"/>
-            <w:r>
-              <w:rPr>
-                <w:rFonts w:ascii="BRH Malayalam Extra" w:hAnsi="BRH Malayalam Extra" w:cs="BRH Devanagari Extra"/>
-                <w:b/>
-                <w:color w:val="000000"/>
-                <w:sz w:val="32"/>
-                <w:szCs w:val="40"/>
-                <w:lang w:bidi="ml-IN"/>
-              </w:rPr>
-              <w:t>–</w:t>
-            </w:r>
-            <w:proofErr w:type="spellStart"/>
+            <w:r>
+              <w:rPr>
+                <w:rFonts w:ascii="BRH Malayalam Extra" w:hAnsi="BRH Malayalam Extra" w:cs="BRH Devanagari Extra"/>
+                <w:b/>
+                <w:color w:val="000000"/>
+                <w:sz w:val="32"/>
+                <w:szCs w:val="40"/>
+                <w:lang w:bidi="ml-IN"/>
+              </w:rPr>
+              <w:t>–</w:t>
+            </w:r>
             <w:r>
               <w:rPr>
                 <w:rFonts w:ascii="BRH Devanagari Extra" w:hAnsi="BRH Devanagari Extra" w:cs="BRH Devanagari Extra"/>
@@ -6958,19 +8668,17 @@
               </w:rPr>
               <w:t>qÉ</w:t>
             </w:r>
-            <w:proofErr w:type="spellEnd"/>
-            <w:r>
-              <w:rPr>
-                <w:rFonts w:ascii="BRH Malayalam Extra" w:hAnsi="BRH Malayalam Extra" w:cs="BRH Devanagari Extra"/>
-                <w:b/>
-                <w:color w:val="000000"/>
-                <w:sz w:val="32"/>
-                <w:szCs w:val="40"/>
-                <w:lang w:bidi="ml-IN"/>
-              </w:rPr>
-              <w:t>–</w:t>
-            </w:r>
-            <w:proofErr w:type="spellStart"/>
+            <w:r>
+              <w:rPr>
+                <w:rFonts w:ascii="BRH Malayalam Extra" w:hAnsi="BRH Malayalam Extra" w:cs="BRH Devanagari Extra"/>
+                <w:b/>
+                <w:color w:val="000000"/>
+                <w:sz w:val="32"/>
+                <w:szCs w:val="40"/>
+                <w:lang w:bidi="ml-IN"/>
+              </w:rPr>
+              <w:t>–</w:t>
+            </w:r>
             <w:r>
               <w:rPr>
                 <w:rFonts w:ascii="BRH Devanagari Extra" w:hAnsi="BRH Devanagari Extra" w:cs="BRH Devanagari Extra"/>
@@ -6982,7 +8690,6 @@
               </w:rPr>
               <w:t>rÉ</w:t>
             </w:r>
-            <w:proofErr w:type="spellEnd"/>
             <w:r>
               <w:rPr>
                 <w:rFonts w:ascii="BRH Malayalam Extra" w:hAnsi="BRH Malayalam Extra" w:cs="BRH Devanagari Extra"/>
@@ -7040,27 +8747,15 @@
               </w:rPr>
               <w:t>–</w:t>
             </w:r>
-            <w:proofErr w:type="spellStart"/>
-            <w:r>
-              <w:rPr>
-                <w:rFonts w:ascii="BRH Devanagari Extra" w:hAnsi="BRH Devanagari Extra" w:cs="BRH Devanagari Extra"/>
-                <w:color w:val="000000"/>
-                <w:sz w:val="40"/>
-                <w:szCs w:val="40"/>
-                <w:lang w:bidi="ml-IN"/>
-              </w:rPr>
-              <w:t>iÉ</w:t>
-            </w:r>
-            <w:proofErr w:type="spellEnd"/>
-            <w:r>
-              <w:rPr>
-                <w:rFonts w:ascii="BRH Devanagari Extra" w:hAnsi="BRH Devanagari Extra" w:cs="BRH Devanagari Extra"/>
-                <w:color w:val="000000"/>
-                <w:sz w:val="40"/>
-                <w:szCs w:val="40"/>
-                <w:lang w:bidi="ml-IN"/>
-              </w:rPr>
-              <w:t xml:space="preserve"> </w:t>
+            <w:r>
+              <w:rPr>
+                <w:rFonts w:ascii="BRH Devanagari Extra" w:hAnsi="BRH Devanagari Extra" w:cs="BRH Devanagari Extra"/>
+                <w:color w:val="000000"/>
+                <w:sz w:val="40"/>
+                <w:szCs w:val="40"/>
+                <w:lang w:bidi="ml-IN"/>
+              </w:rPr>
+              <w:t xml:space="preserve">iÉ </w:t>
             </w:r>
             <w:proofErr w:type="spellStart"/>
             <w:r>
@@ -7218,7 +8913,6 @@
                 <w:lang w:bidi="ml-IN"/>
               </w:rPr>
             </w:pPr>
-            <w:proofErr w:type="spellStart"/>
             <w:r>
               <w:rPr>
                 <w:rFonts w:ascii="BRH Devanagari Extra" w:hAnsi="BRH Devanagari Extra" w:cs="BRH Devanagari Extra"/>
@@ -7229,19 +8923,17 @@
               </w:rPr>
               <w:t>xÉ</w:t>
             </w:r>
-            <w:proofErr w:type="spellEnd"/>
-            <w:r>
-              <w:rPr>
-                <w:rFonts w:ascii="BRH Malayalam Extra" w:hAnsi="BRH Malayalam Extra" w:cs="BRH Devanagari Extra"/>
-                <w:b/>
-                <w:color w:val="000000"/>
-                <w:sz w:val="32"/>
-                <w:szCs w:val="40"/>
-                <w:lang w:bidi="ml-IN"/>
-              </w:rPr>
-              <w:t>–</w:t>
-            </w:r>
-            <w:proofErr w:type="spellStart"/>
+            <w:r>
+              <w:rPr>
+                <w:rFonts w:ascii="BRH Malayalam Extra" w:hAnsi="BRH Malayalam Extra" w:cs="BRH Devanagari Extra"/>
+                <w:b/>
+                <w:color w:val="000000"/>
+                <w:sz w:val="32"/>
+                <w:szCs w:val="40"/>
+                <w:lang w:bidi="ml-IN"/>
+              </w:rPr>
+              <w:t>–</w:t>
+            </w:r>
             <w:r>
               <w:rPr>
                 <w:rFonts w:ascii="BRH Devanagari Extra" w:hAnsi="BRH Devanagari Extra" w:cs="BRH Devanagari Extra"/>
@@ -7252,7 +8944,6 @@
               </w:rPr>
               <w:t>qÉ</w:t>
             </w:r>
-            <w:proofErr w:type="spellEnd"/>
             <w:r>
               <w:rPr>
                 <w:rFonts w:ascii="BRH Malayalam Extra" w:hAnsi="BRH Malayalam Extra" w:cs="BRH Devanagari Extra"/>
@@ -7334,27 +9025,15 @@
               </w:rPr>
               <w:t>–</w:t>
             </w:r>
-            <w:proofErr w:type="spellStart"/>
-            <w:r>
-              <w:rPr>
-                <w:rFonts w:ascii="BRH Devanagari Extra" w:hAnsi="BRH Devanagari Extra" w:cs="BRH Devanagari Extra"/>
-                <w:color w:val="000000"/>
-                <w:sz w:val="40"/>
-                <w:szCs w:val="40"/>
-                <w:lang w:bidi="ml-IN"/>
-              </w:rPr>
-              <w:t>iÉ</w:t>
-            </w:r>
-            <w:proofErr w:type="spellEnd"/>
-            <w:r>
-              <w:rPr>
-                <w:rFonts w:ascii="BRH Devanagari Extra" w:hAnsi="BRH Devanagari Extra" w:cs="BRH Devanagari Extra"/>
-                <w:color w:val="000000"/>
-                <w:sz w:val="40"/>
-                <w:szCs w:val="40"/>
-                <w:lang w:bidi="ml-IN"/>
-              </w:rPr>
-              <w:t xml:space="preserve"> </w:t>
+            <w:r>
+              <w:rPr>
+                <w:rFonts w:ascii="BRH Devanagari Extra" w:hAnsi="BRH Devanagari Extra" w:cs="BRH Devanagari Extra"/>
+                <w:color w:val="000000"/>
+                <w:sz w:val="40"/>
+                <w:szCs w:val="40"/>
+                <w:lang w:bidi="ml-IN"/>
+              </w:rPr>
+              <w:t xml:space="preserve">iÉ </w:t>
             </w:r>
             <w:proofErr w:type="spellStart"/>
             <w:r>
@@ -7690,8 +9369,6 @@
           <w:u w:val="single"/>
         </w:rPr>
       </w:pPr>
-      <w:bookmarkStart w:id="0" w:name="_GoBack"/>
-      <w:bookmarkEnd w:id="0"/>
     </w:p>
     <w:p>
       <w:pPr>
@@ -7882,12 +9559,16 @@
               <w:spacing w:before="0" w:line="240" w:lineRule="auto"/>
               <w:jc w:val="center"/>
               <w:rPr>
+                <w:b/>
+                <w:bCs/>
                 <w:sz w:val="32"/>
                 <w:szCs w:val="32"/>
               </w:rPr>
             </w:pPr>
             <w:r>
               <w:rPr>
+                <w:b/>
+                <w:bCs/>
                 <w:sz w:val="32"/>
                 <w:szCs w:val="32"/>
               </w:rPr>
@@ -7899,12 +9580,16 @@
               <w:spacing w:before="0" w:line="240" w:lineRule="auto"/>
               <w:jc w:val="center"/>
               <w:rPr>
+                <w:b/>
+                <w:bCs/>
                 <w:sz w:val="32"/>
                 <w:szCs w:val="32"/>
               </w:rPr>
             </w:pPr>
             <w:r>
               <w:rPr>
+                <w:b/>
+                <w:bCs/>
                 <w:sz w:val="32"/>
                 <w:szCs w:val="32"/>
               </w:rPr>
@@ -7921,12 +9606,16 @@
               <w:spacing w:before="0" w:line="240" w:lineRule="auto"/>
               <w:jc w:val="center"/>
               <w:rPr>
+                <w:b/>
+                <w:bCs/>
                 <w:sz w:val="32"/>
                 <w:szCs w:val="32"/>
               </w:rPr>
             </w:pPr>
             <w:r>
               <w:rPr>
+                <w:b/>
+                <w:bCs/>
                 <w:sz w:val="32"/>
                 <w:szCs w:val="32"/>
               </w:rPr>
@@ -7944,12 +9633,16 @@
               <w:ind w:right="-18"/>
               <w:jc w:val="center"/>
               <w:rPr>
+                <w:b/>
+                <w:bCs/>
                 <w:sz w:val="32"/>
                 <w:szCs w:val="32"/>
               </w:rPr>
             </w:pPr>
             <w:r>
               <w:rPr>
+                <w:b/>
+                <w:bCs/>
                 <w:sz w:val="32"/>
                 <w:szCs w:val="32"/>
               </w:rPr>
@@ -8083,7 +9776,7 @@
 </file>
 
 <file path=word/endnotes.xml><?xml version="1.0" encoding="utf-8"?>
-<w:endnotes xmlns:wpc="http://schemas.microsoft.com/office/word/2010/wordprocessingCanvas" xmlns:cx="http://schemas.microsoft.com/office/drawing/2014/chartex" xmlns:cx1="http://schemas.microsoft.com/office/drawing/2015/9/8/chartex" xmlns:mc="http://schemas.openxmlformats.org/markup-compatibility/2006" xmlns:o="urn:schemas-microsoft-com:office:office" xmlns:r="http://schemas.openxmlformats.org/officeDocument/2006/relationships" xmlns:m="http://schemas.openxmlformats.org/officeDocument/2006/math" xmlns:v="urn:schemas-microsoft-com:vml" xmlns:wp14="http://schemas.microsoft.com/office/word/2010/wordprocessingDrawing" xmlns:wp="http://schemas.openxmlformats.org/drawingml/2006/wordprocessingDrawing" xmlns:w10="urn:schemas-microsoft-com:office:word" xmlns:w="http://schemas.openxmlformats.org/wordprocessingml/2006/main" xmlns:w14="http://schemas.microsoft.com/office/word/2010/wordml" xmlns:w15="http://schemas.microsoft.com/office/word/2012/wordml" xmlns:w16se="http://schemas.microsoft.com/office/word/2015/wordml/symex" xmlns:wpg="http://schemas.microsoft.com/office/word/2010/wordprocessingGroup" xmlns:wpi="http://schemas.microsoft.com/office/word/2010/wordprocessingInk" xmlns:wne="http://schemas.microsoft.com/office/word/2006/wordml" xmlns:wps="http://schemas.microsoft.com/office/word/2010/wordprocessingShape" mc:Ignorable="w14 w15 w16se wp14">
+<w:endnotes xmlns:wpc="http://schemas.microsoft.com/office/word/2010/wordprocessingCanvas" xmlns:cx="http://schemas.microsoft.com/office/drawing/2014/chartex" xmlns:cx1="http://schemas.microsoft.com/office/drawing/2015/9/8/chartex" xmlns:cx2="http://schemas.microsoft.com/office/drawing/2015/10/21/chartex" xmlns:cx3="http://schemas.microsoft.com/office/drawing/2016/5/9/chartex" xmlns:cx4="http://schemas.microsoft.com/office/drawing/2016/5/10/chartex" xmlns:cx5="http://schemas.microsoft.com/office/drawing/2016/5/11/chartex" xmlns:cx6="http://schemas.microsoft.com/office/drawing/2016/5/12/chartex" xmlns:cx7="http://schemas.microsoft.com/office/drawing/2016/5/13/chartex" xmlns:cx8="http://schemas.microsoft.com/office/drawing/2016/5/14/chartex" xmlns:mc="http://schemas.openxmlformats.org/markup-compatibility/2006" xmlns:aink="http://schemas.microsoft.com/office/drawing/2016/ink" xmlns:am3d="http://schemas.microsoft.com/office/drawing/2017/model3d" xmlns:o="urn:schemas-microsoft-com:office:office" xmlns:oel="http://schemas.microsoft.com/office/2019/extlst" xmlns:r="http://schemas.openxmlformats.org/officeDocument/2006/relationships" xmlns:m="http://schemas.openxmlformats.org/officeDocument/2006/math" xmlns:v="urn:schemas-microsoft-com:vml" xmlns:wp14="http://schemas.microsoft.com/office/word/2010/wordprocessingDrawing" xmlns:wp="http://schemas.openxmlformats.org/drawingml/2006/wordprocessingDrawing" xmlns:w10="urn:schemas-microsoft-com:office:word" xmlns:w="http://schemas.openxmlformats.org/wordprocessingml/2006/main" xmlns:w14="http://schemas.microsoft.com/office/word/2010/wordml" xmlns:w15="http://schemas.microsoft.com/office/word/2012/wordml" xmlns:w16cex="http://schemas.microsoft.com/office/word/2018/wordml/cex" xmlns:w16cid="http://schemas.microsoft.com/office/word/2016/wordml/cid" xmlns:w16="http://schemas.microsoft.com/office/word/2018/wordml" xmlns:w16du="http://schemas.microsoft.com/office/word/2023/wordml/word16du" xmlns:w16sdtdh="http://schemas.microsoft.com/office/word/2020/wordml/sdtdatahash" xmlns:w16sdtfl="http://schemas.microsoft.com/office/word/2024/wordml/sdtformatlock" xmlns:w16se="http://schemas.microsoft.com/office/word/2015/wordml/symex" xmlns:wpg="http://schemas.microsoft.com/office/word/2010/wordprocessingGroup" xmlns:wpi="http://schemas.microsoft.com/office/word/2010/wordprocessingInk" xmlns:wne="http://schemas.microsoft.com/office/word/2006/wordml" xmlns:wps="http://schemas.microsoft.com/office/word/2010/wordprocessingShape" mc:Ignorable="w14 w15 w16se w16cid w16 w16cex w16sdtdh w16sdtfl w16du wp14">
   <w:endnote w:type="separator" w:id="-1">
     <w:p>
       <w:pPr>
@@ -8108,7 +9801,7 @@
 </file>
 
 <file path=word/footer1.xml><?xml version="1.0" encoding="utf-8"?>
-<w:ftr xmlns:wpc="http://schemas.microsoft.com/office/word/2010/wordprocessingCanvas" xmlns:cx="http://schemas.microsoft.com/office/drawing/2014/chartex" xmlns:cx1="http://schemas.microsoft.com/office/drawing/2015/9/8/chartex" xmlns:mc="http://schemas.openxmlformats.org/markup-compatibility/2006" xmlns:o="urn:schemas-microsoft-com:office:office" xmlns:r="http://schemas.openxmlformats.org/officeDocument/2006/relationships" xmlns:m="http://schemas.openxmlformats.org/officeDocument/2006/math" xmlns:v="urn:schemas-microsoft-com:vml" xmlns:wp14="http://schemas.microsoft.com/office/word/2010/wordprocessingDrawing" xmlns:wp="http://schemas.openxmlformats.org/drawingml/2006/wordprocessingDrawing" xmlns:w10="urn:schemas-microsoft-com:office:word" xmlns:w="http://schemas.openxmlformats.org/wordprocessingml/2006/main" xmlns:w14="http://schemas.microsoft.com/office/word/2010/wordml" xmlns:w15="http://schemas.microsoft.com/office/word/2012/wordml" xmlns:w16se="http://schemas.microsoft.com/office/word/2015/wordml/symex" xmlns:wpg="http://schemas.microsoft.com/office/word/2010/wordprocessingGroup" xmlns:wpi="http://schemas.microsoft.com/office/word/2010/wordprocessingInk" xmlns:wne="http://schemas.microsoft.com/office/word/2006/wordml" xmlns:wps="http://schemas.microsoft.com/office/word/2010/wordprocessingShape" mc:Ignorable="w14 w15 w16se wp14">
+<w:ftr xmlns:wpc="http://schemas.microsoft.com/office/word/2010/wordprocessingCanvas" xmlns:cx="http://schemas.microsoft.com/office/drawing/2014/chartex" xmlns:cx1="http://schemas.microsoft.com/office/drawing/2015/9/8/chartex" xmlns:cx2="http://schemas.microsoft.com/office/drawing/2015/10/21/chartex" xmlns:cx3="http://schemas.microsoft.com/office/drawing/2016/5/9/chartex" xmlns:cx4="http://schemas.microsoft.com/office/drawing/2016/5/10/chartex" xmlns:cx5="http://schemas.microsoft.com/office/drawing/2016/5/11/chartex" xmlns:cx6="http://schemas.microsoft.com/office/drawing/2016/5/12/chartex" xmlns:cx7="http://schemas.microsoft.com/office/drawing/2016/5/13/chartex" xmlns:cx8="http://schemas.microsoft.com/office/drawing/2016/5/14/chartex" xmlns:mc="http://schemas.openxmlformats.org/markup-compatibility/2006" xmlns:aink="http://schemas.microsoft.com/office/drawing/2016/ink" xmlns:am3d="http://schemas.microsoft.com/office/drawing/2017/model3d" xmlns:o="urn:schemas-microsoft-com:office:office" xmlns:oel="http://schemas.microsoft.com/office/2019/extlst" xmlns:r="http://schemas.openxmlformats.org/officeDocument/2006/relationships" xmlns:m="http://schemas.openxmlformats.org/officeDocument/2006/math" xmlns:v="urn:schemas-microsoft-com:vml" xmlns:wp14="http://schemas.microsoft.com/office/word/2010/wordprocessingDrawing" xmlns:wp="http://schemas.openxmlformats.org/drawingml/2006/wordprocessingDrawing" xmlns:w10="urn:schemas-microsoft-com:office:word" xmlns:w="http://schemas.openxmlformats.org/wordprocessingml/2006/main" xmlns:w14="http://schemas.microsoft.com/office/word/2010/wordml" xmlns:w15="http://schemas.microsoft.com/office/word/2012/wordml" xmlns:w16cex="http://schemas.microsoft.com/office/word/2018/wordml/cex" xmlns:w16cid="http://schemas.microsoft.com/office/word/2016/wordml/cid" xmlns:w16="http://schemas.microsoft.com/office/word/2018/wordml" xmlns:w16du="http://schemas.microsoft.com/office/word/2023/wordml/word16du" xmlns:w16sdtdh="http://schemas.microsoft.com/office/word/2020/wordml/sdtdatahash" xmlns:w16sdtfl="http://schemas.microsoft.com/office/word/2024/wordml/sdtformatlock" xmlns:w16se="http://schemas.microsoft.com/office/word/2015/wordml/symex" xmlns:wpg="http://schemas.microsoft.com/office/word/2010/wordprocessingGroup" xmlns:wpi="http://schemas.microsoft.com/office/word/2010/wordprocessingInk" xmlns:wne="http://schemas.microsoft.com/office/word/2006/wordml" xmlns:wps="http://schemas.microsoft.com/office/word/2010/wordprocessingShape" mc:Ignorable="w14 w15 w16se w16cid w16 w16cex w16sdtdh w16sdtfl w16du wp14">
   <w:p>
     <w:pPr>
       <w:pBdr>
@@ -8161,14 +9854,35 @@
         <w:bCs/>
       </w:rPr>
       <w:tab/>
-      <w:t xml:space="preserve">              v</w:t>
+      <w:t xml:space="preserve">             </w:t>
     </w:r>
     <w:r>
       <w:rPr>
         <w:b/>
         <w:bCs/>
       </w:rPr>
-      <w:t>edavms@gmail.com</w:t>
+      <w:t>www.</w:t>
+    </w:r>
+    <w:r>
+      <w:rPr>
+        <w:b/>
+        <w:bCs/>
+      </w:rPr>
+      <w:t>v</w:t>
+    </w:r>
+    <w:r>
+      <w:rPr>
+        <w:b/>
+        <w:bCs/>
+      </w:rPr>
+      <w:t>edavms</w:t>
+    </w:r>
+    <w:r>
+      <w:rPr>
+        <w:b/>
+        <w:bCs/>
+      </w:rPr>
+      <w:t>.in</w:t>
     </w:r>
     <w:r>
       <w:rPr>
@@ -8187,6 +9901,9 @@
     </w:r>
     <w:r>
       <w:tab/>
+    </w:r>
+    <w:r>
+      <w:t xml:space="preserve">                      </w:t>
     </w:r>
     <w:r>
       <w:tab/>
@@ -8290,7 +10007,7 @@
 </file>
 
 <file path=word/footer2.xml><?xml version="1.0" encoding="utf-8"?>
-<w:ftr xmlns:wpc="http://schemas.microsoft.com/office/word/2010/wordprocessingCanvas" xmlns:cx="http://schemas.microsoft.com/office/drawing/2014/chartex" xmlns:cx1="http://schemas.microsoft.com/office/drawing/2015/9/8/chartex" xmlns:mc="http://schemas.openxmlformats.org/markup-compatibility/2006" xmlns:o="urn:schemas-microsoft-com:office:office" xmlns:r="http://schemas.openxmlformats.org/officeDocument/2006/relationships" xmlns:m="http://schemas.openxmlformats.org/officeDocument/2006/math" xmlns:v="urn:schemas-microsoft-com:vml" xmlns:wp14="http://schemas.microsoft.com/office/word/2010/wordprocessingDrawing" xmlns:wp="http://schemas.openxmlformats.org/drawingml/2006/wordprocessingDrawing" xmlns:w10="urn:schemas-microsoft-com:office:word" xmlns:w="http://schemas.openxmlformats.org/wordprocessingml/2006/main" xmlns:w14="http://schemas.microsoft.com/office/word/2010/wordml" xmlns:w15="http://schemas.microsoft.com/office/word/2012/wordml" xmlns:w16se="http://schemas.microsoft.com/office/word/2015/wordml/symex" xmlns:wpg="http://schemas.microsoft.com/office/word/2010/wordprocessingGroup" xmlns:wpi="http://schemas.microsoft.com/office/word/2010/wordprocessingInk" xmlns:wne="http://schemas.microsoft.com/office/word/2006/wordml" xmlns:wps="http://schemas.microsoft.com/office/word/2010/wordprocessingShape" mc:Ignorable="w14 w15 w16se wp14">
+<w:ftr xmlns:wpc="http://schemas.microsoft.com/office/word/2010/wordprocessingCanvas" xmlns:cx="http://schemas.microsoft.com/office/drawing/2014/chartex" xmlns:cx1="http://schemas.microsoft.com/office/drawing/2015/9/8/chartex" xmlns:cx2="http://schemas.microsoft.com/office/drawing/2015/10/21/chartex" xmlns:cx3="http://schemas.microsoft.com/office/drawing/2016/5/9/chartex" xmlns:cx4="http://schemas.microsoft.com/office/drawing/2016/5/10/chartex" xmlns:cx5="http://schemas.microsoft.com/office/drawing/2016/5/11/chartex" xmlns:cx6="http://schemas.microsoft.com/office/drawing/2016/5/12/chartex" xmlns:cx7="http://schemas.microsoft.com/office/drawing/2016/5/13/chartex" xmlns:cx8="http://schemas.microsoft.com/office/drawing/2016/5/14/chartex" xmlns:mc="http://schemas.openxmlformats.org/markup-compatibility/2006" xmlns:aink="http://schemas.microsoft.com/office/drawing/2016/ink" xmlns:am3d="http://schemas.microsoft.com/office/drawing/2017/model3d" xmlns:o="urn:schemas-microsoft-com:office:office" xmlns:oel="http://schemas.microsoft.com/office/2019/extlst" xmlns:r="http://schemas.openxmlformats.org/officeDocument/2006/relationships" xmlns:m="http://schemas.openxmlformats.org/officeDocument/2006/math" xmlns:v="urn:schemas-microsoft-com:vml" xmlns:wp14="http://schemas.microsoft.com/office/word/2010/wordprocessingDrawing" xmlns:wp="http://schemas.openxmlformats.org/drawingml/2006/wordprocessingDrawing" xmlns:w10="urn:schemas-microsoft-com:office:word" xmlns:w="http://schemas.openxmlformats.org/wordprocessingml/2006/main" xmlns:w14="http://schemas.microsoft.com/office/word/2010/wordml" xmlns:w15="http://schemas.microsoft.com/office/word/2012/wordml" xmlns:w16cex="http://schemas.microsoft.com/office/word/2018/wordml/cex" xmlns:w16cid="http://schemas.microsoft.com/office/word/2016/wordml/cid" xmlns:w16="http://schemas.microsoft.com/office/word/2018/wordml" xmlns:w16du="http://schemas.microsoft.com/office/word/2023/wordml/word16du" xmlns:w16sdtdh="http://schemas.microsoft.com/office/word/2020/wordml/sdtdatahash" xmlns:w16sdtfl="http://schemas.microsoft.com/office/word/2024/wordml/sdtformatlock" xmlns:w16se="http://schemas.microsoft.com/office/word/2015/wordml/symex" xmlns:wpg="http://schemas.microsoft.com/office/word/2010/wordprocessingGroup" xmlns:wpi="http://schemas.microsoft.com/office/word/2010/wordprocessingInk" xmlns:wne="http://schemas.microsoft.com/office/word/2006/wordml" xmlns:wps="http://schemas.microsoft.com/office/word/2010/wordprocessingShape" mc:Ignorable="w14 w15 w16se w16cid w16 w16cex w16sdtdh w16sdtfl w16du wp14">
   <w:p>
     <w:pPr>
       <w:pBdr>
@@ -8378,7 +10095,13 @@
         <w:bCs/>
       </w:rPr>
       <w:tab/>
-      <w:t xml:space="preserve"> </w:t>
+    </w:r>
+    <w:r>
+      <w:rPr>
+        <w:b/>
+        <w:bCs/>
+      </w:rPr>
+      <w:t xml:space="preserve">                     </w:t>
     </w:r>
     <w:r>
       <w:tab/>
@@ -8493,7 +10216,7 @@
 </file>
 
 <file path=word/footnotes.xml><?xml version="1.0" encoding="utf-8"?>
-<w:footnotes xmlns:wpc="http://schemas.microsoft.com/office/word/2010/wordprocessingCanvas" xmlns:cx="http://schemas.microsoft.com/office/drawing/2014/chartex" xmlns:cx1="http://schemas.microsoft.com/office/drawing/2015/9/8/chartex" xmlns:mc="http://schemas.openxmlformats.org/markup-compatibility/2006" xmlns:o="urn:schemas-microsoft-com:office:office" xmlns:r="http://schemas.openxmlformats.org/officeDocument/2006/relationships" xmlns:m="http://schemas.openxmlformats.org/officeDocument/2006/math" xmlns:v="urn:schemas-microsoft-com:vml" xmlns:wp14="http://schemas.microsoft.com/office/word/2010/wordprocessingDrawing" xmlns:wp="http://schemas.openxmlformats.org/drawingml/2006/wordprocessingDrawing" xmlns:w10="urn:schemas-microsoft-com:office:word" xmlns:w="http://schemas.openxmlformats.org/wordprocessingml/2006/main" xmlns:w14="http://schemas.microsoft.com/office/word/2010/wordml" xmlns:w15="http://schemas.microsoft.com/office/word/2012/wordml" xmlns:w16se="http://schemas.microsoft.com/office/word/2015/wordml/symex" xmlns:wpg="http://schemas.microsoft.com/office/word/2010/wordprocessingGroup" xmlns:wpi="http://schemas.microsoft.com/office/word/2010/wordprocessingInk" xmlns:wne="http://schemas.microsoft.com/office/word/2006/wordml" xmlns:wps="http://schemas.microsoft.com/office/word/2010/wordprocessingShape" mc:Ignorable="w14 w15 w16se wp14">
+<w:footnotes xmlns:wpc="http://schemas.microsoft.com/office/word/2010/wordprocessingCanvas" xmlns:cx="http://schemas.microsoft.com/office/drawing/2014/chartex" xmlns:cx1="http://schemas.microsoft.com/office/drawing/2015/9/8/chartex" xmlns:cx2="http://schemas.microsoft.com/office/drawing/2015/10/21/chartex" xmlns:cx3="http://schemas.microsoft.com/office/drawing/2016/5/9/chartex" xmlns:cx4="http://schemas.microsoft.com/office/drawing/2016/5/10/chartex" xmlns:cx5="http://schemas.microsoft.com/office/drawing/2016/5/11/chartex" xmlns:cx6="http://schemas.microsoft.com/office/drawing/2016/5/12/chartex" xmlns:cx7="http://schemas.microsoft.com/office/drawing/2016/5/13/chartex" xmlns:cx8="http://schemas.microsoft.com/office/drawing/2016/5/14/chartex" xmlns:mc="http://schemas.openxmlformats.org/markup-compatibility/2006" xmlns:aink="http://schemas.microsoft.com/office/drawing/2016/ink" xmlns:am3d="http://schemas.microsoft.com/office/drawing/2017/model3d" xmlns:o="urn:schemas-microsoft-com:office:office" xmlns:oel="http://schemas.microsoft.com/office/2019/extlst" xmlns:r="http://schemas.openxmlformats.org/officeDocument/2006/relationships" xmlns:m="http://schemas.openxmlformats.org/officeDocument/2006/math" xmlns:v="urn:schemas-microsoft-com:vml" xmlns:wp14="http://schemas.microsoft.com/office/word/2010/wordprocessingDrawing" xmlns:wp="http://schemas.openxmlformats.org/drawingml/2006/wordprocessingDrawing" xmlns:w10="urn:schemas-microsoft-com:office:word" xmlns:w="http://schemas.openxmlformats.org/wordprocessingml/2006/main" xmlns:w14="http://schemas.microsoft.com/office/word/2010/wordml" xmlns:w15="http://schemas.microsoft.com/office/word/2012/wordml" xmlns:w16cex="http://schemas.microsoft.com/office/word/2018/wordml/cex" xmlns:w16cid="http://schemas.microsoft.com/office/word/2016/wordml/cid" xmlns:w16="http://schemas.microsoft.com/office/word/2018/wordml" xmlns:w16du="http://schemas.microsoft.com/office/word/2023/wordml/word16du" xmlns:w16sdtdh="http://schemas.microsoft.com/office/word/2020/wordml/sdtdatahash" xmlns:w16sdtfl="http://schemas.microsoft.com/office/word/2024/wordml/sdtformatlock" xmlns:w16se="http://schemas.microsoft.com/office/word/2015/wordml/symex" xmlns:wpg="http://schemas.microsoft.com/office/word/2010/wordprocessingGroup" xmlns:wpi="http://schemas.microsoft.com/office/word/2010/wordprocessingInk" xmlns:wne="http://schemas.microsoft.com/office/word/2006/wordml" xmlns:wps="http://schemas.microsoft.com/office/word/2010/wordprocessingShape" mc:Ignorable="w14 w15 w16se w16cid w16 w16cex w16sdtdh w16sdtfl w16du wp14">
   <w:footnote w:type="separator" w:id="-1">
     <w:p>
       <w:pPr>
@@ -8518,7 +10241,7 @@
 </file>
 
 <file path=word/header1.xml><?xml version="1.0" encoding="utf-8"?>
-<w:hdr xmlns:wpc="http://schemas.microsoft.com/office/word/2010/wordprocessingCanvas" xmlns:cx="http://schemas.microsoft.com/office/drawing/2014/chartex" xmlns:cx1="http://schemas.microsoft.com/office/drawing/2015/9/8/chartex" xmlns:mc="http://schemas.openxmlformats.org/markup-compatibility/2006" xmlns:o="urn:schemas-microsoft-com:office:office" xmlns:r="http://schemas.openxmlformats.org/officeDocument/2006/relationships" xmlns:m="http://schemas.openxmlformats.org/officeDocument/2006/math" xmlns:v="urn:schemas-microsoft-com:vml" xmlns:wp14="http://schemas.microsoft.com/office/word/2010/wordprocessingDrawing" xmlns:wp="http://schemas.openxmlformats.org/drawingml/2006/wordprocessingDrawing" xmlns:w10="urn:schemas-microsoft-com:office:word" xmlns:w="http://schemas.openxmlformats.org/wordprocessingml/2006/main" xmlns:w14="http://schemas.microsoft.com/office/word/2010/wordml" xmlns:w15="http://schemas.microsoft.com/office/word/2012/wordml" xmlns:w16se="http://schemas.microsoft.com/office/word/2015/wordml/symex" xmlns:wpg="http://schemas.microsoft.com/office/word/2010/wordprocessingGroup" xmlns:wpi="http://schemas.microsoft.com/office/word/2010/wordprocessingInk" xmlns:wne="http://schemas.microsoft.com/office/word/2006/wordml" xmlns:wps="http://schemas.microsoft.com/office/word/2010/wordprocessingShape" mc:Ignorable="w14 w15 w16se wp14">
+<w:hdr xmlns:wpc="http://schemas.microsoft.com/office/word/2010/wordprocessingCanvas" xmlns:cx="http://schemas.microsoft.com/office/drawing/2014/chartex" xmlns:cx1="http://schemas.microsoft.com/office/drawing/2015/9/8/chartex" xmlns:cx2="http://schemas.microsoft.com/office/drawing/2015/10/21/chartex" xmlns:cx3="http://schemas.microsoft.com/office/drawing/2016/5/9/chartex" xmlns:cx4="http://schemas.microsoft.com/office/drawing/2016/5/10/chartex" xmlns:cx5="http://schemas.microsoft.com/office/drawing/2016/5/11/chartex" xmlns:cx6="http://schemas.microsoft.com/office/drawing/2016/5/12/chartex" xmlns:cx7="http://schemas.microsoft.com/office/drawing/2016/5/13/chartex" xmlns:cx8="http://schemas.microsoft.com/office/drawing/2016/5/14/chartex" xmlns:mc="http://schemas.openxmlformats.org/markup-compatibility/2006" xmlns:aink="http://schemas.microsoft.com/office/drawing/2016/ink" xmlns:am3d="http://schemas.microsoft.com/office/drawing/2017/model3d" xmlns:o="urn:schemas-microsoft-com:office:office" xmlns:oel="http://schemas.microsoft.com/office/2019/extlst" xmlns:r="http://schemas.openxmlformats.org/officeDocument/2006/relationships" xmlns:m="http://schemas.openxmlformats.org/officeDocument/2006/math" xmlns:v="urn:schemas-microsoft-com:vml" xmlns:wp14="http://schemas.microsoft.com/office/word/2010/wordprocessingDrawing" xmlns:wp="http://schemas.openxmlformats.org/drawingml/2006/wordprocessingDrawing" xmlns:w10="urn:schemas-microsoft-com:office:word" xmlns:w="http://schemas.openxmlformats.org/wordprocessingml/2006/main" xmlns:w14="http://schemas.microsoft.com/office/word/2010/wordml" xmlns:w15="http://schemas.microsoft.com/office/word/2012/wordml" xmlns:w16cex="http://schemas.microsoft.com/office/word/2018/wordml/cex" xmlns:w16cid="http://schemas.microsoft.com/office/word/2016/wordml/cid" xmlns:w16="http://schemas.microsoft.com/office/word/2018/wordml" xmlns:w16du="http://schemas.microsoft.com/office/word/2023/wordml/word16du" xmlns:w16sdtdh="http://schemas.microsoft.com/office/word/2020/wordml/sdtdatahash" xmlns:w16sdtfl="http://schemas.microsoft.com/office/word/2024/wordml/sdtformatlock" xmlns:w16se="http://schemas.microsoft.com/office/word/2015/wordml/symex" xmlns:wpg="http://schemas.microsoft.com/office/word/2010/wordprocessingGroup" xmlns:wpi="http://schemas.microsoft.com/office/word/2010/wordprocessingInk" xmlns:wne="http://schemas.microsoft.com/office/word/2006/wordml" xmlns:wps="http://schemas.microsoft.com/office/word/2010/wordprocessingShape" mc:Ignorable="w14 w15 w16se w16cid w16 w16cex w16sdtdh w16sdtfl w16du wp14">
   <w:p>
     <w:pPr>
       <w:pStyle w:val="Header"/>
@@ -8531,7 +10254,7 @@
 </file>
 
 <file path=word/header2.xml><?xml version="1.0" encoding="utf-8"?>
-<w:hdr xmlns:wpc="http://schemas.microsoft.com/office/word/2010/wordprocessingCanvas" xmlns:cx="http://schemas.microsoft.com/office/drawing/2014/chartex" xmlns:cx1="http://schemas.microsoft.com/office/drawing/2015/9/8/chartex" xmlns:mc="http://schemas.openxmlformats.org/markup-compatibility/2006" xmlns:o="urn:schemas-microsoft-com:office:office" xmlns:r="http://schemas.openxmlformats.org/officeDocument/2006/relationships" xmlns:m="http://schemas.openxmlformats.org/officeDocument/2006/math" xmlns:v="urn:schemas-microsoft-com:vml" xmlns:wp14="http://schemas.microsoft.com/office/word/2010/wordprocessingDrawing" xmlns:wp="http://schemas.openxmlformats.org/drawingml/2006/wordprocessingDrawing" xmlns:w10="urn:schemas-microsoft-com:office:word" xmlns:w="http://schemas.openxmlformats.org/wordprocessingml/2006/main" xmlns:w14="http://schemas.microsoft.com/office/word/2010/wordml" xmlns:w15="http://schemas.microsoft.com/office/word/2012/wordml" xmlns:w16se="http://schemas.microsoft.com/office/word/2015/wordml/symex" xmlns:wpg="http://schemas.microsoft.com/office/word/2010/wordprocessingGroup" xmlns:wpi="http://schemas.microsoft.com/office/word/2010/wordprocessingInk" xmlns:wne="http://schemas.microsoft.com/office/word/2006/wordml" xmlns:wps="http://schemas.microsoft.com/office/word/2010/wordprocessingShape" mc:Ignorable="w14 w15 w16se wp14">
+<w:hdr xmlns:wpc="http://schemas.microsoft.com/office/word/2010/wordprocessingCanvas" xmlns:cx="http://schemas.microsoft.com/office/drawing/2014/chartex" xmlns:cx1="http://schemas.microsoft.com/office/drawing/2015/9/8/chartex" xmlns:cx2="http://schemas.microsoft.com/office/drawing/2015/10/21/chartex" xmlns:cx3="http://schemas.microsoft.com/office/drawing/2016/5/9/chartex" xmlns:cx4="http://schemas.microsoft.com/office/drawing/2016/5/10/chartex" xmlns:cx5="http://schemas.microsoft.com/office/drawing/2016/5/11/chartex" xmlns:cx6="http://schemas.microsoft.com/office/drawing/2016/5/12/chartex" xmlns:cx7="http://schemas.microsoft.com/office/drawing/2016/5/13/chartex" xmlns:cx8="http://schemas.microsoft.com/office/drawing/2016/5/14/chartex" xmlns:mc="http://schemas.openxmlformats.org/markup-compatibility/2006" xmlns:aink="http://schemas.microsoft.com/office/drawing/2016/ink" xmlns:am3d="http://schemas.microsoft.com/office/drawing/2017/model3d" xmlns:o="urn:schemas-microsoft-com:office:office" xmlns:oel="http://schemas.microsoft.com/office/2019/extlst" xmlns:r="http://schemas.openxmlformats.org/officeDocument/2006/relationships" xmlns:m="http://schemas.openxmlformats.org/officeDocument/2006/math" xmlns:v="urn:schemas-microsoft-com:vml" xmlns:wp14="http://schemas.microsoft.com/office/word/2010/wordprocessingDrawing" xmlns:wp="http://schemas.openxmlformats.org/drawingml/2006/wordprocessingDrawing" xmlns:w10="urn:schemas-microsoft-com:office:word" xmlns:w="http://schemas.openxmlformats.org/wordprocessingml/2006/main" xmlns:w14="http://schemas.microsoft.com/office/word/2010/wordml" xmlns:w15="http://schemas.microsoft.com/office/word/2012/wordml" xmlns:w16cex="http://schemas.microsoft.com/office/word/2018/wordml/cex" xmlns:w16cid="http://schemas.microsoft.com/office/word/2016/wordml/cid" xmlns:w16="http://schemas.microsoft.com/office/word/2018/wordml" xmlns:w16du="http://schemas.microsoft.com/office/word/2023/wordml/word16du" xmlns:w16sdtdh="http://schemas.microsoft.com/office/word/2020/wordml/sdtdatahash" xmlns:w16sdtfl="http://schemas.microsoft.com/office/word/2024/wordml/sdtformatlock" xmlns:w16se="http://schemas.microsoft.com/office/word/2015/wordml/symex" xmlns:wpg="http://schemas.microsoft.com/office/word/2010/wordprocessingGroup" xmlns:wpi="http://schemas.microsoft.com/office/word/2010/wordprocessingInk" xmlns:wne="http://schemas.microsoft.com/office/word/2006/wordml" xmlns:wps="http://schemas.microsoft.com/office/word/2010/wordprocessingShape" mc:Ignorable="w14 w15 w16se w16cid w16 w16cex w16sdtdh w16sdtfl w16du wp14">
   <w:p>
     <w:pPr>
       <w:pStyle w:val="Header"/>
@@ -8544,7 +10267,7 @@
 </file>
 
 <file path=word/styles.xml><?xml version="1.0" encoding="utf-8"?>
-<w:styles xmlns:mc="http://schemas.openxmlformats.org/markup-compatibility/2006" xmlns:r="http://schemas.openxmlformats.org/officeDocument/2006/relationships" xmlns:w="http://schemas.openxmlformats.org/wordprocessingml/2006/main" xmlns:w14="http://schemas.microsoft.com/office/word/2010/wordml" xmlns:w15="http://schemas.microsoft.com/office/word/2012/wordml" xmlns:w16se="http://schemas.microsoft.com/office/word/2015/wordml/symex" mc:Ignorable="w14 w15 w16se">
+<w:styles xmlns:mc="http://schemas.openxmlformats.org/markup-compatibility/2006" xmlns:r="http://schemas.openxmlformats.org/officeDocument/2006/relationships" xmlns:w="http://schemas.openxmlformats.org/wordprocessingml/2006/main" xmlns:w14="http://schemas.microsoft.com/office/word/2010/wordml" xmlns:w15="http://schemas.microsoft.com/office/word/2012/wordml" xmlns:w16cex="http://schemas.microsoft.com/office/word/2018/wordml/cex" xmlns:w16cid="http://schemas.microsoft.com/office/word/2016/wordml/cid" xmlns:w16="http://schemas.microsoft.com/office/word/2018/wordml" xmlns:w16du="http://schemas.microsoft.com/office/word/2023/wordml/word16du" xmlns:w16sdtdh="http://schemas.microsoft.com/office/word/2020/wordml/sdtdatahash" xmlns:w16sdtfl="http://schemas.microsoft.com/office/word/2024/wordml/sdtformatlock" xmlns:w16se="http://schemas.microsoft.com/office/word/2015/wordml/symex" mc:Ignorable="w14 w15 w16se w16cid w16 w16cex w16sdtdh w16sdtfl w16du">
   <w:docDefaults>
     <w:rPrDefault>
       <w:rPr>
@@ -8554,7 +10277,7 @@
     </w:rPrDefault>
     <w:pPrDefault/>
   </w:docDefaults>
-  <w:latentStyles w:defLockedState="0" w:defUIPriority="99" w:defSemiHidden="0" w:defUnhideWhenUsed="0" w:defQFormat="0" w:count="371">
+  <w:latentStyles w:defLockedState="0" w:defUIPriority="99" w:defSemiHidden="0" w:defUnhideWhenUsed="0" w:defQFormat="0" w:count="376">
     <w:lsdException w:name="Normal" w:uiPriority="0" w:qFormat="1"/>
     <w:lsdException w:name="heading 1" w:uiPriority="9" w:qFormat="1"/>
     <w:lsdException w:name="heading 2" w:semiHidden="1" w:uiPriority="9" w:unhideWhenUsed="1" w:qFormat="1"/>
@@ -8926,11 +10649,16 @@
     <w:lsdException w:name="List Table 5 Dark Accent 6" w:uiPriority="50"/>
     <w:lsdException w:name="List Table 6 Colorful Accent 6" w:uiPriority="51"/>
     <w:lsdException w:name="List Table 7 Colorful Accent 6" w:uiPriority="52"/>
+    <w:lsdException w:name="Mention" w:semiHidden="1" w:unhideWhenUsed="1"/>
+    <w:lsdException w:name="Smart Hyperlink" w:semiHidden="1" w:unhideWhenUsed="1"/>
+    <w:lsdException w:name="Hashtag" w:semiHidden="1" w:unhideWhenUsed="1"/>
+    <w:lsdException w:name="Unresolved Mention" w:semiHidden="1" w:unhideWhenUsed="1"/>
+    <w:lsdException w:name="Smart Link" w:semiHidden="1" w:unhideWhenUsed="1"/>
   </w:latentStyles>
   <w:style w:type="paragraph" w:default="1" w:styleId="Normal">
     <w:name w:val="Normal"/>
     <w:qFormat/>
-    <w:rsid w:val="00076C05"/>
+    <w:rsid w:val="000A0CF0"/>
     <w:pPr>
       <w:spacing w:before="120" w:line="276" w:lineRule="auto"/>
     </w:pPr>

</xml_diff>